<commit_message>
Add versioned semantic golden corpus
</commit_message>
<xml_diff>
--- a/examples/advanced/WordToolkit-advanced-torture-test.docx
+++ b/examples/advanced/WordToolkit-advanced-torture-test.docx
@@ -146,12 +146,12 @@
       <w:r>
         <w:t xml:space="preserve">Rewizja testowa zmienia frazę wersja </w:t>
       </w:r>
-      <w:del w:id="1" w:author="WordToolkit QA" w:date="2026-07-18T23:02:54Z">
+      <w:del w:id="1" w:author="WordToolkit QA" w:date="2026-07-22T17:51:41Z">
         <w:r>
           <w:delText xml:space="preserve">robocza</w:delText>
         </w:r>
       </w:del>
-      <w:ins w:id="2" w:author="WordToolkit QA" w:date="2026-07-18T23:02:54Z">
+      <w:ins w:id="2" w:author="WordToolkit QA" w:date="2026-07-22T17:51:41Z">
         <w:r>
           <w:t xml:space="preserve">zatwierdzona</w:t>
         </w:r>
@@ -159,7 +159,7 @@
       <w:r>
         <w:t xml:space="preserve"> na wersja zatwierdzona i usuwa token </w:t>
       </w:r>
-      <w:del w:id="3" w:author="WordToolkit QA" w:date="2026-07-18T23:02:54Z">
+      <w:del w:id="3" w:author="WordToolkit QA" w:date="2026-07-22T17:51:41Z">
         <w:r>
           <w:delText xml:space="preserve">LEGACY</w:delText>
         </w:r>
@@ -300,7 +300,7 @@
       <w:tr>
         <w:trPr>
           <w:tblHeader/>
-          <w:ins w:id="4" w:author="WordToolkit QA" w:date="2026-07-18T23:02:54Z"/>
+          <w:ins w:id="4" w:author="WordToolkit QA" w:date="2026-07-22T17:51:41Z"/>
         </w:trPr>
         <w:tc>
           <w:tcPr>
@@ -441,7 +441,7 @@
       </w:tr>
       <w:tr>
         <w:trPr>
-          <w:ins w:id="5" w:author="WordToolkit QA" w:date="2026-07-18T23:02:54Z"/>
+          <w:ins w:id="5" w:author="WordToolkit QA" w:date="2026-07-22T17:51:41Z"/>
         </w:trPr>
         <w:tc>
           <w:tcPr>
@@ -550,7 +550,7 @@
       </w:tr>
       <w:tr>
         <w:trPr>
-          <w:ins w:id="6" w:author="WordToolkit QA" w:date="2026-07-18T23:02:54Z"/>
+          <w:ins w:id="6" w:author="WordToolkit QA" w:date="2026-07-22T17:51:41Z"/>
         </w:trPr>
         <w:tc>
           <w:tcPr>
@@ -659,7 +659,7 @@
       </w:tr>
       <w:tr>
         <w:trPr>
-          <w:ins w:id="7" w:author="WordToolkit QA" w:date="2026-07-18T23:02:54Z"/>
+          <w:ins w:id="7" w:author="WordToolkit QA" w:date="2026-07-22T17:51:41Z"/>
         </w:trPr>
         <w:tc>
           <w:tcPr>
@@ -768,7 +768,7 @@
       </w:tr>
       <w:tr>
         <w:trPr>
-          <w:ins w:id="8" w:author="WordToolkit QA" w:date="2026-07-18T23:02:54Z"/>
+          <w:ins w:id="8" w:author="WordToolkit QA" w:date="2026-07-22T17:51:41Z"/>
         </w:trPr>
         <w:tc>
           <w:tcPr>
@@ -877,7 +877,7 @@
       </w:tr>
       <w:tr>
         <w:trPr>
-          <w:ins w:id="9" w:author="WordToolkit QA" w:date="2026-07-18T23:02:54Z"/>
+          <w:ins w:id="9" w:author="WordToolkit QA" w:date="2026-07-22T17:51:41Z"/>
         </w:trPr>
         <w:tc>
           <w:tcPr>
@@ -986,7 +986,7 @@
       </w:tr>
       <w:tr>
         <w:trPr>
-          <w:ins w:id="10" w:author="WordToolkit QA" w:date="2026-07-18T23:02:54Z"/>
+          <w:ins w:id="10" w:author="WordToolkit QA" w:date="2026-07-22T17:51:41Z"/>
         </w:trPr>
         <w:tc>
           <w:tcPr>
@@ -1095,7 +1095,7 @@
       </w:tr>
       <w:tr>
         <w:trPr>
-          <w:ins w:id="11" w:author="WordToolkit QA" w:date="2026-07-18T23:02:54Z"/>
+          <w:ins w:id="11" w:author="WordToolkit QA" w:date="2026-07-22T17:51:41Z"/>
         </w:trPr>
         <w:tc>
           <w:tcPr>
@@ -1204,7 +1204,7 @@
       </w:tr>
       <w:tr>
         <w:trPr>
-          <w:ins w:id="12" w:author="WordToolkit QA" w:date="2026-07-18T23:02:54Z"/>
+          <w:ins w:id="12" w:author="WordToolkit QA" w:date="2026-07-22T17:51:41Z"/>
         </w:trPr>
         <w:tc>
           <w:tcPr>
@@ -1313,7 +1313,7 @@
       </w:tr>
       <w:tr>
         <w:trPr>
-          <w:ins w:id="13" w:author="WordToolkit QA" w:date="2026-07-18T23:02:54Z"/>
+          <w:ins w:id="13" w:author="WordToolkit QA" w:date="2026-07-22T17:51:41Z"/>
         </w:trPr>
         <w:tc>
           <w:tcPr>
@@ -1422,7 +1422,7 @@
       </w:tr>
       <w:tr>
         <w:trPr>
-          <w:ins w:id="14" w:author="WordToolkit QA" w:date="2026-07-18T23:02:54Z"/>
+          <w:ins w:id="14" w:author="WordToolkit QA" w:date="2026-07-22T17:51:41Z"/>
         </w:trPr>
         <w:tc>
           <w:tcPr>
@@ -1531,7 +1531,7 @@
       </w:tr>
       <w:tr>
         <w:trPr>
-          <w:ins w:id="15" w:author="WordToolkit QA" w:date="2026-07-18T23:02:54Z"/>
+          <w:ins w:id="15" w:author="WordToolkit QA" w:date="2026-07-22T17:51:41Z"/>
         </w:trPr>
         <w:tc>
           <w:tcPr>
@@ -1640,7 +1640,7 @@
       </w:tr>
       <w:tr>
         <w:trPr>
-          <w:ins w:id="16" w:author="WordToolkit QA" w:date="2026-07-18T23:02:54Z"/>
+          <w:ins w:id="16" w:author="WordToolkit QA" w:date="2026-07-22T17:51:41Z"/>
         </w:trPr>
         <w:tc>
           <w:tcPr>
@@ -1749,7 +1749,7 @@
       </w:tr>
       <w:tr>
         <w:trPr>
-          <w:ins w:id="17" w:author="WordToolkit QA" w:date="2026-07-18T23:02:54Z"/>
+          <w:ins w:id="17" w:author="WordToolkit QA" w:date="2026-07-22T17:51:41Z"/>
         </w:trPr>
         <w:tc>
           <w:tcPr>
@@ -1858,7 +1858,7 @@
       </w:tr>
       <w:tr>
         <w:trPr>
-          <w:ins w:id="18" w:author="WordToolkit QA" w:date="2026-07-18T23:02:54Z"/>
+          <w:ins w:id="18" w:author="WordToolkit QA" w:date="2026-07-22T17:51:41Z"/>
         </w:trPr>
         <w:tc>
           <w:tcPr>
@@ -1967,7 +1967,7 @@
       </w:tr>
       <w:tr>
         <w:trPr>
-          <w:ins w:id="19" w:author="WordToolkit QA" w:date="2026-07-18T23:02:54Z"/>
+          <w:ins w:id="19" w:author="WordToolkit QA" w:date="2026-07-22T17:51:41Z"/>
         </w:trPr>
         <w:tc>
           <w:tcPr>
@@ -2076,7 +2076,7 @@
       </w:tr>
       <w:tr>
         <w:trPr>
-          <w:ins w:id="20" w:author="WordToolkit QA" w:date="2026-07-18T23:02:54Z"/>
+          <w:ins w:id="20" w:author="WordToolkit QA" w:date="2026-07-22T17:51:41Z"/>
         </w:trPr>
         <w:tc>
           <w:tcPr>
@@ -2185,7 +2185,7 @@
       </w:tr>
       <w:tr>
         <w:trPr>
-          <w:ins w:id="21" w:author="WordToolkit QA" w:date="2026-07-18T23:02:54Z"/>
+          <w:ins w:id="21" w:author="WordToolkit QA" w:date="2026-07-22T17:51:41Z"/>
         </w:trPr>
         <w:tc>
           <w:tcPr>
@@ -2294,7 +2294,7 @@
       </w:tr>
       <w:tr>
         <w:trPr>
-          <w:ins w:id="22" w:author="WordToolkit QA" w:date="2026-07-18T23:02:54Z"/>
+          <w:ins w:id="22" w:author="WordToolkit QA" w:date="2026-07-22T17:51:41Z"/>
         </w:trPr>
         <w:tc>
           <w:tcPr>
@@ -2403,7 +2403,7 @@
       </w:tr>
       <w:tr>
         <w:trPr>
-          <w:ins w:id="23" w:author="WordToolkit QA" w:date="2026-07-18T23:02:54Z"/>
+          <w:ins w:id="23" w:author="WordToolkit QA" w:date="2026-07-22T17:51:41Z"/>
         </w:trPr>
         <w:tc>
           <w:tcPr>
@@ -2512,7 +2512,7 @@
       </w:tr>
       <w:tr>
         <w:trPr>
-          <w:ins w:id="24" w:author="WordToolkit QA" w:date="2026-07-18T23:02:54Z"/>
+          <w:ins w:id="24" w:author="WordToolkit QA" w:date="2026-07-22T17:51:41Z"/>
         </w:trPr>
         <w:tc>
           <w:tcPr>
@@ -2621,7 +2621,7 @@
       </w:tr>
       <w:tr>
         <w:trPr>
-          <w:ins w:id="25" w:author="WordToolkit QA" w:date="2026-07-18T23:02:54Z"/>
+          <w:ins w:id="25" w:author="WordToolkit QA" w:date="2026-07-22T17:51:41Z"/>
         </w:trPr>
         <w:tc>
           <w:tcPr>
@@ -2730,7 +2730,7 @@
       </w:tr>
       <w:tr>
         <w:trPr>
-          <w:ins w:id="26" w:author="WordToolkit QA" w:date="2026-07-18T23:02:54Z"/>
+          <w:ins w:id="26" w:author="WordToolkit QA" w:date="2026-07-22T17:51:41Z"/>
         </w:trPr>
         <w:tc>
           <w:tcPr>
@@ -2839,7 +2839,7 @@
       </w:tr>
       <w:tr>
         <w:trPr>
-          <w:ins w:id="27" w:author="WordToolkit QA" w:date="2026-07-18T23:02:54Z"/>
+          <w:ins w:id="27" w:author="WordToolkit QA" w:date="2026-07-22T17:51:41Z"/>
         </w:trPr>
         <w:tc>
           <w:tcPr>
@@ -2948,7 +2948,7 @@
       </w:tr>
       <w:tr>
         <w:trPr>
-          <w:ins w:id="28" w:author="WordToolkit QA" w:date="2026-07-18T23:02:54Z"/>
+          <w:ins w:id="28" w:author="WordToolkit QA" w:date="2026-07-22T17:51:41Z"/>
         </w:trPr>
         <w:tc>
           <w:tcPr>
@@ -3057,7 +3057,7 @@
       </w:tr>
       <w:tr>
         <w:trPr>
-          <w:ins w:id="29" w:author="WordToolkit QA" w:date="2026-07-18T23:02:54Z"/>
+          <w:ins w:id="29" w:author="WordToolkit QA" w:date="2026-07-22T17:51:41Z"/>
         </w:trPr>
         <w:tc>
           <w:tcPr>
@@ -3166,7 +3166,7 @@
       </w:tr>
       <w:tr>
         <w:trPr>
-          <w:ins w:id="30" w:author="WordToolkit QA" w:date="2026-07-18T23:02:54Z"/>
+          <w:ins w:id="30" w:author="WordToolkit QA" w:date="2026-07-22T17:51:41Z"/>
         </w:trPr>
         <w:tc>
           <w:tcPr>
@@ -3275,7 +3275,7 @@
       </w:tr>
       <w:tr>
         <w:trPr>
-          <w:ins w:id="31" w:author="WordToolkit QA" w:date="2026-07-18T23:02:54Z"/>
+          <w:ins w:id="31" w:author="WordToolkit QA" w:date="2026-07-22T17:51:41Z"/>
         </w:trPr>
         <w:tc>
           <w:tcPr>
@@ -3372,7 +3372,7 @@
       </w:tr>
       <w:tr>
         <w:trPr>
-          <w:ins w:id="32" w:author="WordToolkit QA" w:date="2026-07-18T23:02:54Z"/>
+          <w:ins w:id="32" w:author="WordToolkit QA" w:date="2026-07-22T17:51:41Z"/>
         </w:trPr>
         <w:tc>
           <w:tcPr>
@@ -3542,7 +3542,7 @@
       <w:tr>
         <w:trPr>
           <w:tblHeader/>
-          <w:ins w:id="33" w:author="WordToolkit QA" w:date="2026-07-18T23:02:54Z"/>
+          <w:ins w:id="33" w:author="WordToolkit QA" w:date="2026-07-22T17:51:41Z"/>
         </w:trPr>
         <w:tc>
           <w:tcPr>
@@ -3615,7 +3615,7 @@
       </w:tr>
       <w:tr>
         <w:trPr>
-          <w:ins w:id="34" w:author="WordToolkit QA" w:date="2026-07-18T23:02:54Z"/>
+          <w:ins w:id="34" w:author="WordToolkit QA" w:date="2026-07-22T17:51:41Z"/>
         </w:trPr>
         <w:tc>
           <w:tcPr>
@@ -3672,7 +3672,7 @@
       </w:tr>
       <w:tr>
         <w:trPr>
-          <w:ins w:id="35" w:author="WordToolkit QA" w:date="2026-07-18T23:02:54Z"/>
+          <w:ins w:id="35" w:author="WordToolkit QA" w:date="2026-07-22T17:51:41Z"/>
         </w:trPr>
         <w:tc>
           <w:tcPr>
@@ -3726,7 +3726,7 @@
       </w:tr>
       <w:tr>
         <w:trPr>
-          <w:ins w:id="36" w:author="WordToolkit QA" w:date="2026-07-18T23:02:54Z"/>
+          <w:ins w:id="36" w:author="WordToolkit QA" w:date="2026-07-22T17:51:41Z"/>
         </w:trPr>
         <w:tc>
           <w:tcPr>
@@ -3783,7 +3783,7 @@
       </w:tr>
       <w:tr>
         <w:trPr>
-          <w:ins w:id="37" w:author="WordToolkit QA" w:date="2026-07-18T23:02:54Z"/>
+          <w:ins w:id="37" w:author="WordToolkit QA" w:date="2026-07-22T17:51:41Z"/>
         </w:trPr>
         <w:tc>
           <w:tcPr>
@@ -5644,7 +5644,7 @@
 
 <file path=word/comments.xml><?xml version="1.0" encoding="utf-8"?>
 <w:comments xmlns:w="http://schemas.openxmlformats.org/wordprocessingml/2006/main" xmlns:w14="http://schemas.microsoft.com/office/word/2010/wordml" xmlns:r="http://schemas.openxmlformats.org/officeDocument/2006/relationships">
-  <w:comment w:id="0" w:author="Reviewer A" w:date="2026-07-18T23:02:54Z" w:initials="RA">
+  <w:comment w:id="0" w:author="Reviewer A" w:date="2026-07-22T17:51:41Z" w:initials="RA">
     <w:p>
       <w:r>
         <w:rPr>
@@ -5657,7 +5657,7 @@
       </w:r>
     </w:p>
   </w:comment>
-  <w:comment w:id="1" w:author="Reviewer B" w:date="2026-07-18T23:02:54Z" w:initials="RB">
+  <w:comment w:id="1" w:author="Reviewer B" w:date="2026-07-22T17:51:41Z" w:initials="RB">
     <w:p>
       <w:r>
         <w:t xml:space="preserve">Semantyka zweryfikowana.</w:t>
@@ -5669,8 +5669,8 @@
 
 <file path=word/commentsExtended.xml><?xml version="1.0" encoding="utf-8"?>
 <w15:commentsEx xmlns:w15="http://schemas.microsoft.com/office/word/2012/wordml" xmlns:w14="http://schemas.microsoft.com/office/word/2010/wordml">
-  <w15:commentEx w15:paraId="05E4D113" w15:done="0"/>
-  <w15:commentEx w15:paraId="3798B474" w15:paraIdParent="05E4D113" w15:done="0"/>
+  <w15:commentEx w15:paraId="41BAA2E6" w15:done="0"/>
+  <w15:commentEx w15:paraId="645CC3A7" w15:paraIdParent="41BAA2E6" w15:done="0"/>
 </w15:commentsEx>
 </file>
 
@@ -5702,7 +5702,7 @@
 
 <file path=word/footer1.xml><?xml version="1.0" encoding="utf-8"?>
 <w:ftr xmlns:w="http://schemas.openxmlformats.org/wordprocessingml/2006/main">
-  <w:p xmlns:ns0="http://schemas.microsoft.com/office/word/2010/wordml" ns0:paraId="7CC3BC68" ns0:textId="77777777">
+  <w:p xmlns:ns0="http://schemas.microsoft.com/office/word/2010/wordml" ns0:paraId="23D3CCBE" ns0:textId="77777777">
     <w:r>
       <w:t xml:space="preserve">WordToolkit • test zaawansowany • </w:t>
     </w:r>
@@ -5725,7 +5725,7 @@
 
 <file path=word/footer10.xml><?xml version="1.0" encoding="utf-8"?>
 <w:ftr xmlns:w="http://schemas.openxmlformats.org/wordprocessingml/2006/main">
-  <w:p xmlns:ns0="http://schemas.microsoft.com/office/word/2010/wordml" ns0:paraId="1D212026" ns0:textId="77777777">
+  <w:p xmlns:ns0="http://schemas.microsoft.com/office/word/2010/wordml" ns0:paraId="44D95B6F" ns0:textId="77777777">
     <w:r>
       <w:t xml:space="preserve">WordToolkit • test zaawansowany • </w:t>
     </w:r>
@@ -5748,7 +5748,7 @@
 
 <file path=word/footer11.xml><?xml version="1.0" encoding="utf-8"?>
 <w:ftr xmlns:w="http://schemas.openxmlformats.org/wordprocessingml/2006/main">
-  <w:p xmlns:ns0="http://schemas.microsoft.com/office/word/2010/wordml" ns0:paraId="0EEB7DE3" ns0:textId="77777777">
+  <w:p xmlns:ns0="http://schemas.microsoft.com/office/word/2010/wordml" ns0:paraId="30EBB753" ns0:textId="77777777">
     <w:r>
       <w:t xml:space="preserve">WordToolkit • sekcja 4 • </w:t>
     </w:r>
@@ -5771,7 +5771,7 @@
 
 <file path=word/footer12.xml><?xml version="1.0" encoding="utf-8"?>
 <w:ftr xmlns:w="http://schemas.openxmlformats.org/wordprocessingml/2006/main">
-  <w:p xmlns:ns0="http://schemas.microsoft.com/office/word/2010/wordml" ns0:paraId="56625646" ns0:textId="77777777">
+  <w:p xmlns:ns0="http://schemas.microsoft.com/office/word/2010/wordml" ns0:paraId="554297F7" ns0:textId="77777777">
     <w:r>
       <w:t xml:space="preserve">WordToolkit • strona parzysta • </w:t>
     </w:r>
@@ -5794,7 +5794,7 @@
 
 <file path=word/footer2.xml><?xml version="1.0" encoding="utf-8"?>
 <w:ftr xmlns:w="http://schemas.openxmlformats.org/wordprocessingml/2006/main">
-  <w:p xmlns:ns0="http://schemas.microsoft.com/office/word/2010/wordml" ns0:paraId="1CC039DC" ns0:textId="77777777">
+  <w:p xmlns:ns0="http://schemas.microsoft.com/office/word/2010/wordml" ns0:paraId="26ADA44B" ns0:textId="77777777">
     <w:r>
       <w:t xml:space="preserve">WordToolkit • sekcja 1 • </w:t>
     </w:r>
@@ -5817,7 +5817,7 @@
 
 <file path=word/footer3.xml><?xml version="1.0" encoding="utf-8"?>
 <w:ftr xmlns:w="http://schemas.openxmlformats.org/wordprocessingml/2006/main">
-  <w:p xmlns:ns0="http://schemas.microsoft.com/office/word/2010/wordml" ns0:paraId="3EEA624C" ns0:textId="77777777">
+  <w:p xmlns:ns0="http://schemas.microsoft.com/office/word/2010/wordml" ns0:paraId="71F4B339" ns0:textId="77777777">
     <w:r>
       <w:t xml:space="preserve">WordToolkit • strona parzysta • </w:t>
     </w:r>
@@ -5840,7 +5840,7 @@
 
 <file path=word/footer4.xml><?xml version="1.0" encoding="utf-8"?>
 <w:ftr xmlns:w="http://schemas.openxmlformats.org/wordprocessingml/2006/main">
-  <w:p xmlns:ns0="http://schemas.microsoft.com/office/word/2010/wordml" ns0:paraId="20D21BF8" ns0:textId="77777777">
+  <w:p xmlns:ns0="http://schemas.microsoft.com/office/word/2010/wordml" ns0:paraId="7E97F75D" ns0:textId="77777777">
     <w:r>
       <w:t xml:space="preserve">WordToolkit • test zaawansowany • </w:t>
     </w:r>
@@ -5863,7 +5863,7 @@
 
 <file path=word/footer5.xml><?xml version="1.0" encoding="utf-8"?>
 <w:ftr xmlns:w="http://schemas.openxmlformats.org/wordprocessingml/2006/main">
-  <w:p xmlns:ns0="http://schemas.microsoft.com/office/word/2010/wordml" ns0:paraId="2E72CEBC" ns0:textId="77777777">
+  <w:p xmlns:ns0="http://schemas.microsoft.com/office/word/2010/wordml" ns0:paraId="0E773BAA" ns0:textId="77777777">
     <w:r>
       <w:t xml:space="preserve">WordToolkit • sekcja 2 • </w:t>
     </w:r>
@@ -5886,7 +5886,7 @@
 
 <file path=word/footer6.xml><?xml version="1.0" encoding="utf-8"?>
 <w:ftr xmlns:w="http://schemas.openxmlformats.org/wordprocessingml/2006/main">
-  <w:p xmlns:ns0="http://schemas.microsoft.com/office/word/2010/wordml" ns0:paraId="6BB2B697" ns0:textId="77777777">
+  <w:p xmlns:ns0="http://schemas.microsoft.com/office/word/2010/wordml" ns0:paraId="35187E71" ns0:textId="77777777">
     <w:r>
       <w:t xml:space="preserve">WordToolkit • strona parzysta • </w:t>
     </w:r>
@@ -5909,7 +5909,7 @@
 
 <file path=word/footer7.xml><?xml version="1.0" encoding="utf-8"?>
 <w:ftr xmlns:w="http://schemas.openxmlformats.org/wordprocessingml/2006/main">
-  <w:p xmlns:ns0="http://schemas.microsoft.com/office/word/2010/wordml" ns0:paraId="683331B4" ns0:textId="77777777">
+  <w:p xmlns:ns0="http://schemas.microsoft.com/office/word/2010/wordml" ns0:paraId="2D82D19E" ns0:textId="77777777">
     <w:r>
       <w:t xml:space="preserve">WordToolkit • test zaawansowany • </w:t>
     </w:r>
@@ -5932,7 +5932,7 @@
 
 <file path=word/footer8.xml><?xml version="1.0" encoding="utf-8"?>
 <w:ftr xmlns:w="http://schemas.openxmlformats.org/wordprocessingml/2006/main">
-  <w:p xmlns:ns0="http://schemas.microsoft.com/office/word/2010/wordml" ns0:paraId="4395C6C8" ns0:textId="77777777">
+  <w:p xmlns:ns0="http://schemas.microsoft.com/office/word/2010/wordml" ns0:paraId="6737D432" ns0:textId="77777777">
     <w:r>
       <w:t xml:space="preserve">WordToolkit • sekcja 3 • </w:t>
     </w:r>
@@ -5955,7 +5955,7 @@
 
 <file path=word/footer9.xml><?xml version="1.0" encoding="utf-8"?>
 <w:ftr xmlns:w="http://schemas.openxmlformats.org/wordprocessingml/2006/main">
-  <w:p xmlns:ns0="http://schemas.microsoft.com/office/word/2010/wordml" ns0:paraId="50F5D955" ns0:textId="77777777">
+  <w:p xmlns:ns0="http://schemas.microsoft.com/office/word/2010/wordml" ns0:paraId="499A6DAC" ns0:textId="77777777">
     <w:r>
       <w:t xml:space="preserve">WordToolkit • strona parzysta • </w:t>
     </w:r>
@@ -6028,7 +6028,7 @@
 
 <file path=word/header10.xml><?xml version="1.0" encoding="utf-8"?>
 <w:hdr xmlns:w="http://schemas.openxmlformats.org/wordprocessingml/2006/main">
-  <w:p xmlns:ns0="http://schemas.microsoft.com/office/word/2010/wordml" ns0:paraId="5797C89E" ns0:textId="77777777">
+  <w:p xmlns:ns0="http://schemas.microsoft.com/office/word/2010/wordml" ns0:paraId="07361DBC" ns0:textId="77777777">
     <w:r>
       <w:t>WordToolkit • strona parzysta</w:t>
     </w:r>
@@ -6038,7 +6038,7 @@
 
 <file path=word/header11.xml><?xml version="1.0" encoding="utf-8"?>
 <w:hdr xmlns:w="http://schemas.openxmlformats.org/wordprocessingml/2006/main">
-  <w:p xmlns:ns0="http://schemas.microsoft.com/office/word/2010/wordml" ns0:paraId="43E56ED6" ns0:textId="77777777">
+  <w:p xmlns:ns0="http://schemas.microsoft.com/office/word/2010/wordml" ns0:paraId="76762CF6" ns0:textId="77777777">
     <w:r>
       <w:t>WordToolkit • sekcja 4</w:t>
     </w:r>
@@ -6048,7 +6048,7 @@
 
 <file path=word/header12.xml><?xml version="1.0" encoding="utf-8"?>
 <w:hdr xmlns:w="http://schemas.openxmlformats.org/wordprocessingml/2006/main">
-  <w:p xmlns:ns0="http://schemas.microsoft.com/office/word/2010/wordml" ns0:paraId="34D99024" ns0:textId="77777777">
+  <w:p xmlns:ns0="http://schemas.microsoft.com/office/word/2010/wordml" ns0:paraId="2C05ACDF" ns0:textId="77777777">
     <w:r>
       <w:t>WordToolkit • strona parzysta</w:t>
     </w:r>
@@ -6058,7 +6058,7 @@
 
 <file path=word/header2.xml><?xml version="1.0" encoding="utf-8"?>
 <w:hdr xmlns:w="http://schemas.openxmlformats.org/wordprocessingml/2006/main">
-  <w:p xmlns:ns0="http://schemas.microsoft.com/office/word/2010/wordml" ns0:paraId="6D53DC1C" ns0:textId="77777777">
+  <w:p xmlns:ns0="http://schemas.microsoft.com/office/word/2010/wordml" ns0:paraId="6472E9B2" ns0:textId="77777777">
     <w:r>
       <w:t>WordToolkit • test zaawansowany</w:t>
     </w:r>
@@ -6068,7 +6068,7 @@
 
 <file path=word/header3.xml><?xml version="1.0" encoding="utf-8"?>
 <w:hdr xmlns:w="http://schemas.openxmlformats.org/wordprocessingml/2006/main">
-  <w:p xmlns:ns0="http://schemas.microsoft.com/office/word/2010/wordml" ns0:paraId="73852417" ns0:textId="77777777">
+  <w:p xmlns:ns0="http://schemas.microsoft.com/office/word/2010/wordml" ns0:paraId="2BAA4E06" ns0:textId="77777777">
     <w:r>
       <w:t>WordToolkit • sekcja 1</w:t>
     </w:r>
@@ -6078,7 +6078,7 @@
 
 <file path=word/header4.xml><?xml version="1.0" encoding="utf-8"?>
 <w:hdr xmlns:w="http://schemas.openxmlformats.org/wordprocessingml/2006/main">
-  <w:p xmlns:ns0="http://schemas.microsoft.com/office/word/2010/wordml" ns0:paraId="39E11DE0" ns0:textId="77777777">
+  <w:p xmlns:ns0="http://schemas.microsoft.com/office/word/2010/wordml" ns0:paraId="53C98ACA" ns0:textId="77777777">
     <w:r>
       <w:t>WordToolkit • strona parzysta</w:t>
     </w:r>
@@ -6088,7 +6088,7 @@
 
 <file path=word/header5.xml><?xml version="1.0" encoding="utf-8"?>
 <w:hdr xmlns:w="http://schemas.openxmlformats.org/wordprocessingml/2006/main">
-  <w:p xmlns:ns0="http://schemas.microsoft.com/office/word/2010/wordml" ns0:paraId="4C14C012" ns0:textId="77777777">
+  <w:p xmlns:ns0="http://schemas.microsoft.com/office/word/2010/wordml" ns0:paraId="0E92427B" ns0:textId="77777777">
     <w:r>
       <w:t>WordToolkit • test zaawansowany</w:t>
     </w:r>
@@ -6098,7 +6098,7 @@
 
 <file path=word/header6.xml><?xml version="1.0" encoding="utf-8"?>
 <w:hdr xmlns:w="http://schemas.openxmlformats.org/wordprocessingml/2006/main">
-  <w:p xmlns:ns0="http://schemas.microsoft.com/office/word/2010/wordml" ns0:paraId="1330F2BB" ns0:textId="77777777">
+  <w:p xmlns:ns0="http://schemas.microsoft.com/office/word/2010/wordml" ns0:paraId="41297885" ns0:textId="77777777">
     <w:r>
       <w:t>WordToolkit • sekcja 2</w:t>
     </w:r>
@@ -6108,7 +6108,7 @@
 
 <file path=word/header7.xml><?xml version="1.0" encoding="utf-8"?>
 <w:hdr xmlns:w="http://schemas.openxmlformats.org/wordprocessingml/2006/main">
-  <w:p xmlns:ns0="http://schemas.microsoft.com/office/word/2010/wordml" ns0:paraId="6CFB66EB" ns0:textId="77777777">
+  <w:p xmlns:ns0="http://schemas.microsoft.com/office/word/2010/wordml" ns0:paraId="206C8C21" ns0:textId="77777777">
     <w:r>
       <w:t>WordToolkit • strona parzysta</w:t>
     </w:r>
@@ -6118,7 +6118,7 @@
 
 <file path=word/header8.xml><?xml version="1.0" encoding="utf-8"?>
 <w:hdr xmlns:w="http://schemas.openxmlformats.org/wordprocessingml/2006/main">
-  <w:p xmlns:ns0="http://schemas.microsoft.com/office/word/2010/wordml" ns0:paraId="71853FD3" ns0:textId="77777777">
+  <w:p xmlns:ns0="http://schemas.microsoft.com/office/word/2010/wordml" ns0:paraId="05D585EB" ns0:textId="77777777">
     <w:r>
       <w:t>WordToolkit • test zaawansowany</w:t>
     </w:r>
@@ -6128,7 +6128,7 @@
 
 <file path=word/header9.xml><?xml version="1.0" encoding="utf-8"?>
 <w:hdr xmlns:w="http://schemas.openxmlformats.org/wordprocessingml/2006/main">
-  <w:p xmlns:ns0="http://schemas.microsoft.com/office/word/2010/wordml" ns0:paraId="507145C2" ns0:textId="77777777">
+  <w:p xmlns:ns0="http://schemas.microsoft.com/office/word/2010/wordml" ns0:paraId="4BB43D2B" ns0:textId="77777777">
     <w:r>
       <w:t>WordToolkit • sekcja 3</w:t>
     </w:r>

</xml_diff>

<commit_message>
Harden live equation workflows and publication
</commit_message>
<xml_diff>
--- a/examples/advanced/WordToolkit-advanced-torture-test.docx
+++ b/examples/advanced/WordToolkit-advanced-torture-test.docx
@@ -146,12 +146,12 @@
       <w:r>
         <w:t xml:space="preserve">Rewizja testowa zmienia frazę wersja </w:t>
       </w:r>
-      <w:del w:id="1" w:author="WordToolkit QA" w:date="2026-07-22T17:51:41Z">
+      <w:del w:id="1" w:author="WordToolkit QA" w:date="2026-07-25T22:47:45Z">
         <w:r>
           <w:delText xml:space="preserve">robocza</w:delText>
         </w:r>
       </w:del>
-      <w:ins w:id="2" w:author="WordToolkit QA" w:date="2026-07-22T17:51:41Z">
+      <w:ins w:id="2" w:author="WordToolkit QA" w:date="2026-07-25T22:47:45Z">
         <w:r>
           <w:t xml:space="preserve">zatwierdzona</w:t>
         </w:r>
@@ -159,7 +159,7 @@
       <w:r>
         <w:t xml:space="preserve"> na wersja zatwierdzona i usuwa token </w:t>
       </w:r>
-      <w:del w:id="3" w:author="WordToolkit QA" w:date="2026-07-22T17:51:41Z">
+      <w:del w:id="3" w:author="WordToolkit QA" w:date="2026-07-25T22:47:45Z">
         <w:r>
           <w:delText xml:space="preserve">LEGACY</w:delText>
         </w:r>
@@ -300,7 +300,7 @@
       <w:tr>
         <w:trPr>
           <w:tblHeader/>
-          <w:ins w:id="4" w:author="WordToolkit QA" w:date="2026-07-22T17:51:41Z"/>
+          <w:ins w:id="4" w:author="WordToolkit QA" w:date="2026-07-25T22:47:45Z"/>
         </w:trPr>
         <w:tc>
           <w:tcPr>
@@ -441,7 +441,7 @@
       </w:tr>
       <w:tr>
         <w:trPr>
-          <w:ins w:id="5" w:author="WordToolkit QA" w:date="2026-07-22T17:51:41Z"/>
+          <w:ins w:id="5" w:author="WordToolkit QA" w:date="2026-07-25T22:47:45Z"/>
         </w:trPr>
         <w:tc>
           <w:tcPr>
@@ -550,7 +550,7 @@
       </w:tr>
       <w:tr>
         <w:trPr>
-          <w:ins w:id="6" w:author="WordToolkit QA" w:date="2026-07-22T17:51:41Z"/>
+          <w:ins w:id="6" w:author="WordToolkit QA" w:date="2026-07-25T22:47:45Z"/>
         </w:trPr>
         <w:tc>
           <w:tcPr>
@@ -659,7 +659,7 @@
       </w:tr>
       <w:tr>
         <w:trPr>
-          <w:ins w:id="7" w:author="WordToolkit QA" w:date="2026-07-22T17:51:41Z"/>
+          <w:ins w:id="7" w:author="WordToolkit QA" w:date="2026-07-25T22:47:45Z"/>
         </w:trPr>
         <w:tc>
           <w:tcPr>
@@ -768,7 +768,7 @@
       </w:tr>
       <w:tr>
         <w:trPr>
-          <w:ins w:id="8" w:author="WordToolkit QA" w:date="2026-07-22T17:51:41Z"/>
+          <w:ins w:id="8" w:author="WordToolkit QA" w:date="2026-07-25T22:47:45Z"/>
         </w:trPr>
         <w:tc>
           <w:tcPr>
@@ -877,7 +877,7 @@
       </w:tr>
       <w:tr>
         <w:trPr>
-          <w:ins w:id="9" w:author="WordToolkit QA" w:date="2026-07-22T17:51:41Z"/>
+          <w:ins w:id="9" w:author="WordToolkit QA" w:date="2026-07-25T22:47:45Z"/>
         </w:trPr>
         <w:tc>
           <w:tcPr>
@@ -986,7 +986,7 @@
       </w:tr>
       <w:tr>
         <w:trPr>
-          <w:ins w:id="10" w:author="WordToolkit QA" w:date="2026-07-22T17:51:41Z"/>
+          <w:ins w:id="10" w:author="WordToolkit QA" w:date="2026-07-25T22:47:45Z"/>
         </w:trPr>
         <w:tc>
           <w:tcPr>
@@ -1095,7 +1095,7 @@
       </w:tr>
       <w:tr>
         <w:trPr>
-          <w:ins w:id="11" w:author="WordToolkit QA" w:date="2026-07-22T17:51:41Z"/>
+          <w:ins w:id="11" w:author="WordToolkit QA" w:date="2026-07-25T22:47:45Z"/>
         </w:trPr>
         <w:tc>
           <w:tcPr>
@@ -1204,7 +1204,7 @@
       </w:tr>
       <w:tr>
         <w:trPr>
-          <w:ins w:id="12" w:author="WordToolkit QA" w:date="2026-07-22T17:51:41Z"/>
+          <w:ins w:id="12" w:author="WordToolkit QA" w:date="2026-07-25T22:47:45Z"/>
         </w:trPr>
         <w:tc>
           <w:tcPr>
@@ -1313,7 +1313,7 @@
       </w:tr>
       <w:tr>
         <w:trPr>
-          <w:ins w:id="13" w:author="WordToolkit QA" w:date="2026-07-22T17:51:41Z"/>
+          <w:ins w:id="13" w:author="WordToolkit QA" w:date="2026-07-25T22:47:45Z"/>
         </w:trPr>
         <w:tc>
           <w:tcPr>
@@ -1422,7 +1422,7 @@
       </w:tr>
       <w:tr>
         <w:trPr>
-          <w:ins w:id="14" w:author="WordToolkit QA" w:date="2026-07-22T17:51:41Z"/>
+          <w:ins w:id="14" w:author="WordToolkit QA" w:date="2026-07-25T22:47:45Z"/>
         </w:trPr>
         <w:tc>
           <w:tcPr>
@@ -1531,7 +1531,7 @@
       </w:tr>
       <w:tr>
         <w:trPr>
-          <w:ins w:id="15" w:author="WordToolkit QA" w:date="2026-07-22T17:51:41Z"/>
+          <w:ins w:id="15" w:author="WordToolkit QA" w:date="2026-07-25T22:47:45Z"/>
         </w:trPr>
         <w:tc>
           <w:tcPr>
@@ -1640,7 +1640,7 @@
       </w:tr>
       <w:tr>
         <w:trPr>
-          <w:ins w:id="16" w:author="WordToolkit QA" w:date="2026-07-22T17:51:41Z"/>
+          <w:ins w:id="16" w:author="WordToolkit QA" w:date="2026-07-25T22:47:45Z"/>
         </w:trPr>
         <w:tc>
           <w:tcPr>
@@ -1749,7 +1749,7 @@
       </w:tr>
       <w:tr>
         <w:trPr>
-          <w:ins w:id="17" w:author="WordToolkit QA" w:date="2026-07-22T17:51:41Z"/>
+          <w:ins w:id="17" w:author="WordToolkit QA" w:date="2026-07-25T22:47:45Z"/>
         </w:trPr>
         <w:tc>
           <w:tcPr>
@@ -1858,7 +1858,7 @@
       </w:tr>
       <w:tr>
         <w:trPr>
-          <w:ins w:id="18" w:author="WordToolkit QA" w:date="2026-07-22T17:51:41Z"/>
+          <w:ins w:id="18" w:author="WordToolkit QA" w:date="2026-07-25T22:47:45Z"/>
         </w:trPr>
         <w:tc>
           <w:tcPr>
@@ -1967,7 +1967,7 @@
       </w:tr>
       <w:tr>
         <w:trPr>
-          <w:ins w:id="19" w:author="WordToolkit QA" w:date="2026-07-22T17:51:41Z"/>
+          <w:ins w:id="19" w:author="WordToolkit QA" w:date="2026-07-25T22:47:45Z"/>
         </w:trPr>
         <w:tc>
           <w:tcPr>
@@ -2076,7 +2076,7 @@
       </w:tr>
       <w:tr>
         <w:trPr>
-          <w:ins w:id="20" w:author="WordToolkit QA" w:date="2026-07-22T17:51:41Z"/>
+          <w:ins w:id="20" w:author="WordToolkit QA" w:date="2026-07-25T22:47:45Z"/>
         </w:trPr>
         <w:tc>
           <w:tcPr>
@@ -2185,7 +2185,7 @@
       </w:tr>
       <w:tr>
         <w:trPr>
-          <w:ins w:id="21" w:author="WordToolkit QA" w:date="2026-07-22T17:51:41Z"/>
+          <w:ins w:id="21" w:author="WordToolkit QA" w:date="2026-07-25T22:47:45Z"/>
         </w:trPr>
         <w:tc>
           <w:tcPr>
@@ -2294,7 +2294,7 @@
       </w:tr>
       <w:tr>
         <w:trPr>
-          <w:ins w:id="22" w:author="WordToolkit QA" w:date="2026-07-22T17:51:41Z"/>
+          <w:ins w:id="22" w:author="WordToolkit QA" w:date="2026-07-25T22:47:45Z"/>
         </w:trPr>
         <w:tc>
           <w:tcPr>
@@ -2403,7 +2403,7 @@
       </w:tr>
       <w:tr>
         <w:trPr>
-          <w:ins w:id="23" w:author="WordToolkit QA" w:date="2026-07-22T17:51:41Z"/>
+          <w:ins w:id="23" w:author="WordToolkit QA" w:date="2026-07-25T22:47:45Z"/>
         </w:trPr>
         <w:tc>
           <w:tcPr>
@@ -2512,7 +2512,7 @@
       </w:tr>
       <w:tr>
         <w:trPr>
-          <w:ins w:id="24" w:author="WordToolkit QA" w:date="2026-07-22T17:51:41Z"/>
+          <w:ins w:id="24" w:author="WordToolkit QA" w:date="2026-07-25T22:47:45Z"/>
         </w:trPr>
         <w:tc>
           <w:tcPr>
@@ -2621,7 +2621,7 @@
       </w:tr>
       <w:tr>
         <w:trPr>
-          <w:ins w:id="25" w:author="WordToolkit QA" w:date="2026-07-22T17:51:41Z"/>
+          <w:ins w:id="25" w:author="WordToolkit QA" w:date="2026-07-25T22:47:45Z"/>
         </w:trPr>
         <w:tc>
           <w:tcPr>
@@ -2730,7 +2730,7 @@
       </w:tr>
       <w:tr>
         <w:trPr>
-          <w:ins w:id="26" w:author="WordToolkit QA" w:date="2026-07-22T17:51:41Z"/>
+          <w:ins w:id="26" w:author="WordToolkit QA" w:date="2026-07-25T22:47:45Z"/>
         </w:trPr>
         <w:tc>
           <w:tcPr>
@@ -2839,7 +2839,7 @@
       </w:tr>
       <w:tr>
         <w:trPr>
-          <w:ins w:id="27" w:author="WordToolkit QA" w:date="2026-07-22T17:51:41Z"/>
+          <w:ins w:id="27" w:author="WordToolkit QA" w:date="2026-07-25T22:47:45Z"/>
         </w:trPr>
         <w:tc>
           <w:tcPr>
@@ -2948,7 +2948,7 @@
       </w:tr>
       <w:tr>
         <w:trPr>
-          <w:ins w:id="28" w:author="WordToolkit QA" w:date="2026-07-22T17:51:41Z"/>
+          <w:ins w:id="28" w:author="WordToolkit QA" w:date="2026-07-25T22:47:45Z"/>
         </w:trPr>
         <w:tc>
           <w:tcPr>
@@ -3057,7 +3057,7 @@
       </w:tr>
       <w:tr>
         <w:trPr>
-          <w:ins w:id="29" w:author="WordToolkit QA" w:date="2026-07-22T17:51:41Z"/>
+          <w:ins w:id="29" w:author="WordToolkit QA" w:date="2026-07-25T22:47:45Z"/>
         </w:trPr>
         <w:tc>
           <w:tcPr>
@@ -3166,7 +3166,7 @@
       </w:tr>
       <w:tr>
         <w:trPr>
-          <w:ins w:id="30" w:author="WordToolkit QA" w:date="2026-07-22T17:51:41Z"/>
+          <w:ins w:id="30" w:author="WordToolkit QA" w:date="2026-07-25T22:47:45Z"/>
         </w:trPr>
         <w:tc>
           <w:tcPr>
@@ -3275,7 +3275,7 @@
       </w:tr>
       <w:tr>
         <w:trPr>
-          <w:ins w:id="31" w:author="WordToolkit QA" w:date="2026-07-22T17:51:41Z"/>
+          <w:ins w:id="31" w:author="WordToolkit QA" w:date="2026-07-25T22:47:45Z"/>
         </w:trPr>
         <w:tc>
           <w:tcPr>
@@ -3372,7 +3372,7 @@
       </w:tr>
       <w:tr>
         <w:trPr>
-          <w:ins w:id="32" w:author="WordToolkit QA" w:date="2026-07-22T17:51:41Z"/>
+          <w:ins w:id="32" w:author="WordToolkit QA" w:date="2026-07-25T22:47:45Z"/>
         </w:trPr>
         <w:tc>
           <w:tcPr>
@@ -3542,7 +3542,7 @@
       <w:tr>
         <w:trPr>
           <w:tblHeader/>
-          <w:ins w:id="33" w:author="WordToolkit QA" w:date="2026-07-22T17:51:41Z"/>
+          <w:ins w:id="33" w:author="WordToolkit QA" w:date="2026-07-25T22:47:46Z"/>
         </w:trPr>
         <w:tc>
           <w:tcPr>
@@ -3615,7 +3615,7 @@
       </w:tr>
       <w:tr>
         <w:trPr>
-          <w:ins w:id="34" w:author="WordToolkit QA" w:date="2026-07-22T17:51:41Z"/>
+          <w:ins w:id="34" w:author="WordToolkit QA" w:date="2026-07-25T22:47:46Z"/>
         </w:trPr>
         <w:tc>
           <w:tcPr>
@@ -3672,7 +3672,7 @@
       </w:tr>
       <w:tr>
         <w:trPr>
-          <w:ins w:id="35" w:author="WordToolkit QA" w:date="2026-07-22T17:51:41Z"/>
+          <w:ins w:id="35" w:author="WordToolkit QA" w:date="2026-07-25T22:47:46Z"/>
         </w:trPr>
         <w:tc>
           <w:tcPr>
@@ -3726,7 +3726,7 @@
       </w:tr>
       <w:tr>
         <w:trPr>
-          <w:ins w:id="36" w:author="WordToolkit QA" w:date="2026-07-22T17:51:41Z"/>
+          <w:ins w:id="36" w:author="WordToolkit QA" w:date="2026-07-25T22:47:46Z"/>
         </w:trPr>
         <w:tc>
           <w:tcPr>
@@ -3783,7 +3783,7 @@
       </w:tr>
       <w:tr>
         <w:trPr>
-          <w:ins w:id="37" w:author="WordToolkit QA" w:date="2026-07-22T17:51:41Z"/>
+          <w:ins w:id="37" w:author="WordToolkit QA" w:date="2026-07-25T22:47:46Z"/>
         </w:trPr>
         <w:tc>
           <w:tcPr>
@@ -5644,7 +5644,7 @@
 
 <file path=word/comments.xml><?xml version="1.0" encoding="utf-8"?>
 <w:comments xmlns:w="http://schemas.openxmlformats.org/wordprocessingml/2006/main" xmlns:w14="http://schemas.microsoft.com/office/word/2010/wordml" xmlns:r="http://schemas.openxmlformats.org/officeDocument/2006/relationships">
-  <w:comment w:id="0" w:author="Reviewer A" w:date="2026-07-22T17:51:41Z" w:initials="RA">
+  <w:comment w:id="0" w:author="Reviewer A" w:date="2026-07-25T22:47:45Z" w:initials="RA">
     <w:p>
       <w:r>
         <w:rPr>
@@ -5657,7 +5657,7 @@
       </w:r>
     </w:p>
   </w:comment>
-  <w:comment w:id="1" w:author="Reviewer B" w:date="2026-07-22T17:51:41Z" w:initials="RB">
+  <w:comment w:id="1" w:author="Reviewer B" w:date="2026-07-25T22:47:45Z" w:initials="RB">
     <w:p>
       <w:r>
         <w:t xml:space="preserve">Semantyka zweryfikowana.</w:t>
@@ -5669,8 +5669,8 @@
 
 <file path=word/commentsExtended.xml><?xml version="1.0" encoding="utf-8"?>
 <w15:commentsEx xmlns:w15="http://schemas.microsoft.com/office/word/2012/wordml" xmlns:w14="http://schemas.microsoft.com/office/word/2010/wordml">
-  <w15:commentEx w15:paraId="41BAA2E6" w15:done="0"/>
-  <w15:commentEx w15:paraId="645CC3A7" w15:paraIdParent="41BAA2E6" w15:done="0"/>
+  <w15:commentEx w15:paraId="6CD49D5E" w15:done="0"/>
+  <w15:commentEx w15:paraId="36FD0962" w15:paraIdParent="6CD49D5E" w15:done="0"/>
 </w15:commentsEx>
 </file>
 
@@ -5702,7 +5702,7 @@
 
 <file path=word/footer1.xml><?xml version="1.0" encoding="utf-8"?>
 <w:ftr xmlns:w="http://schemas.openxmlformats.org/wordprocessingml/2006/main">
-  <w:p xmlns:ns0="http://schemas.microsoft.com/office/word/2010/wordml" ns0:paraId="23D3CCBE" ns0:textId="77777777">
+  <w:p xmlns:ns0="http://schemas.microsoft.com/office/word/2010/wordml" ns0:paraId="2DC7AA3C" ns0:textId="77777777">
     <w:r>
       <w:t xml:space="preserve">WordToolkit • test zaawansowany • </w:t>
     </w:r>
@@ -5725,7 +5725,7 @@
 
 <file path=word/footer10.xml><?xml version="1.0" encoding="utf-8"?>
 <w:ftr xmlns:w="http://schemas.openxmlformats.org/wordprocessingml/2006/main">
-  <w:p xmlns:ns0="http://schemas.microsoft.com/office/word/2010/wordml" ns0:paraId="44D95B6F" ns0:textId="77777777">
+  <w:p xmlns:ns0="http://schemas.microsoft.com/office/word/2010/wordml" ns0:paraId="3BE50D70" ns0:textId="77777777">
     <w:r>
       <w:t xml:space="preserve">WordToolkit • test zaawansowany • </w:t>
     </w:r>
@@ -5748,7 +5748,7 @@
 
 <file path=word/footer11.xml><?xml version="1.0" encoding="utf-8"?>
 <w:ftr xmlns:w="http://schemas.openxmlformats.org/wordprocessingml/2006/main">
-  <w:p xmlns:ns0="http://schemas.microsoft.com/office/word/2010/wordml" ns0:paraId="30EBB753" ns0:textId="77777777">
+  <w:p xmlns:ns0="http://schemas.microsoft.com/office/word/2010/wordml" ns0:paraId="133FFFBF" ns0:textId="77777777">
     <w:r>
       <w:t xml:space="preserve">WordToolkit • sekcja 4 • </w:t>
     </w:r>
@@ -5771,7 +5771,7 @@
 
 <file path=word/footer12.xml><?xml version="1.0" encoding="utf-8"?>
 <w:ftr xmlns:w="http://schemas.openxmlformats.org/wordprocessingml/2006/main">
-  <w:p xmlns:ns0="http://schemas.microsoft.com/office/word/2010/wordml" ns0:paraId="554297F7" ns0:textId="77777777">
+  <w:p xmlns:ns0="http://schemas.microsoft.com/office/word/2010/wordml" ns0:paraId="5C848ECF" ns0:textId="77777777">
     <w:r>
       <w:t xml:space="preserve">WordToolkit • strona parzysta • </w:t>
     </w:r>
@@ -5794,7 +5794,7 @@
 
 <file path=word/footer2.xml><?xml version="1.0" encoding="utf-8"?>
 <w:ftr xmlns:w="http://schemas.openxmlformats.org/wordprocessingml/2006/main">
-  <w:p xmlns:ns0="http://schemas.microsoft.com/office/word/2010/wordml" ns0:paraId="26ADA44B" ns0:textId="77777777">
+  <w:p xmlns:ns0="http://schemas.microsoft.com/office/word/2010/wordml" ns0:paraId="11F9B257" ns0:textId="77777777">
     <w:r>
       <w:t xml:space="preserve">WordToolkit • sekcja 1 • </w:t>
     </w:r>
@@ -5817,7 +5817,7 @@
 
 <file path=word/footer3.xml><?xml version="1.0" encoding="utf-8"?>
 <w:ftr xmlns:w="http://schemas.openxmlformats.org/wordprocessingml/2006/main">
-  <w:p xmlns:ns0="http://schemas.microsoft.com/office/word/2010/wordml" ns0:paraId="71F4B339" ns0:textId="77777777">
+  <w:p xmlns:ns0="http://schemas.microsoft.com/office/word/2010/wordml" ns0:paraId="7970127A" ns0:textId="77777777">
     <w:r>
       <w:t xml:space="preserve">WordToolkit • strona parzysta • </w:t>
     </w:r>
@@ -5840,7 +5840,7 @@
 
 <file path=word/footer4.xml><?xml version="1.0" encoding="utf-8"?>
 <w:ftr xmlns:w="http://schemas.openxmlformats.org/wordprocessingml/2006/main">
-  <w:p xmlns:ns0="http://schemas.microsoft.com/office/word/2010/wordml" ns0:paraId="7E97F75D" ns0:textId="77777777">
+  <w:p xmlns:ns0="http://schemas.microsoft.com/office/word/2010/wordml" ns0:paraId="17DFB039" ns0:textId="77777777">
     <w:r>
       <w:t xml:space="preserve">WordToolkit • test zaawansowany • </w:t>
     </w:r>
@@ -5863,7 +5863,7 @@
 
 <file path=word/footer5.xml><?xml version="1.0" encoding="utf-8"?>
 <w:ftr xmlns:w="http://schemas.openxmlformats.org/wordprocessingml/2006/main">
-  <w:p xmlns:ns0="http://schemas.microsoft.com/office/word/2010/wordml" ns0:paraId="0E773BAA" ns0:textId="77777777">
+  <w:p xmlns:ns0="http://schemas.microsoft.com/office/word/2010/wordml" ns0:paraId="0239A9CA" ns0:textId="77777777">
     <w:r>
       <w:t xml:space="preserve">WordToolkit • sekcja 2 • </w:t>
     </w:r>
@@ -5886,7 +5886,7 @@
 
 <file path=word/footer6.xml><?xml version="1.0" encoding="utf-8"?>
 <w:ftr xmlns:w="http://schemas.openxmlformats.org/wordprocessingml/2006/main">
-  <w:p xmlns:ns0="http://schemas.microsoft.com/office/word/2010/wordml" ns0:paraId="35187E71" ns0:textId="77777777">
+  <w:p xmlns:ns0="http://schemas.microsoft.com/office/word/2010/wordml" ns0:paraId="23AD38E6" ns0:textId="77777777">
     <w:r>
       <w:t xml:space="preserve">WordToolkit • strona parzysta • </w:t>
     </w:r>
@@ -5909,7 +5909,7 @@
 
 <file path=word/footer7.xml><?xml version="1.0" encoding="utf-8"?>
 <w:ftr xmlns:w="http://schemas.openxmlformats.org/wordprocessingml/2006/main">
-  <w:p xmlns:ns0="http://schemas.microsoft.com/office/word/2010/wordml" ns0:paraId="2D82D19E" ns0:textId="77777777">
+  <w:p xmlns:ns0="http://schemas.microsoft.com/office/word/2010/wordml" ns0:paraId="3813B4EC" ns0:textId="77777777">
     <w:r>
       <w:t xml:space="preserve">WordToolkit • test zaawansowany • </w:t>
     </w:r>
@@ -5932,7 +5932,7 @@
 
 <file path=word/footer8.xml><?xml version="1.0" encoding="utf-8"?>
 <w:ftr xmlns:w="http://schemas.openxmlformats.org/wordprocessingml/2006/main">
-  <w:p xmlns:ns0="http://schemas.microsoft.com/office/word/2010/wordml" ns0:paraId="6737D432" ns0:textId="77777777">
+  <w:p xmlns:ns0="http://schemas.microsoft.com/office/word/2010/wordml" ns0:paraId="0BB04A47" ns0:textId="77777777">
     <w:r>
       <w:t xml:space="preserve">WordToolkit • sekcja 3 • </w:t>
     </w:r>
@@ -5955,7 +5955,7 @@
 
 <file path=word/footer9.xml><?xml version="1.0" encoding="utf-8"?>
 <w:ftr xmlns:w="http://schemas.openxmlformats.org/wordprocessingml/2006/main">
-  <w:p xmlns:ns0="http://schemas.microsoft.com/office/word/2010/wordml" ns0:paraId="499A6DAC" ns0:textId="77777777">
+  <w:p xmlns:ns0="http://schemas.microsoft.com/office/word/2010/wordml" ns0:paraId="43CF3990" ns0:textId="77777777">
     <w:r>
       <w:t xml:space="preserve">WordToolkit • strona parzysta • </w:t>
     </w:r>
@@ -6028,7 +6028,7 @@
 
 <file path=word/header10.xml><?xml version="1.0" encoding="utf-8"?>
 <w:hdr xmlns:w="http://schemas.openxmlformats.org/wordprocessingml/2006/main">
-  <w:p xmlns:ns0="http://schemas.microsoft.com/office/word/2010/wordml" ns0:paraId="07361DBC" ns0:textId="77777777">
+  <w:p xmlns:ns0="http://schemas.microsoft.com/office/word/2010/wordml" ns0:paraId="0B14D23F" ns0:textId="77777777">
     <w:r>
       <w:t>WordToolkit • strona parzysta</w:t>
     </w:r>
@@ -6038,7 +6038,7 @@
 
 <file path=word/header11.xml><?xml version="1.0" encoding="utf-8"?>
 <w:hdr xmlns:w="http://schemas.openxmlformats.org/wordprocessingml/2006/main">
-  <w:p xmlns:ns0="http://schemas.microsoft.com/office/word/2010/wordml" ns0:paraId="76762CF6" ns0:textId="77777777">
+  <w:p xmlns:ns0="http://schemas.microsoft.com/office/word/2010/wordml" ns0:paraId="72B54ED7" ns0:textId="77777777">
     <w:r>
       <w:t>WordToolkit • sekcja 4</w:t>
     </w:r>
@@ -6048,7 +6048,7 @@
 
 <file path=word/header12.xml><?xml version="1.0" encoding="utf-8"?>
 <w:hdr xmlns:w="http://schemas.openxmlformats.org/wordprocessingml/2006/main">
-  <w:p xmlns:ns0="http://schemas.microsoft.com/office/word/2010/wordml" ns0:paraId="2C05ACDF" ns0:textId="77777777">
+  <w:p xmlns:ns0="http://schemas.microsoft.com/office/word/2010/wordml" ns0:paraId="1A474B4C" ns0:textId="77777777">
     <w:r>
       <w:t>WordToolkit • strona parzysta</w:t>
     </w:r>
@@ -6058,7 +6058,7 @@
 
 <file path=word/header2.xml><?xml version="1.0" encoding="utf-8"?>
 <w:hdr xmlns:w="http://schemas.openxmlformats.org/wordprocessingml/2006/main">
-  <w:p xmlns:ns0="http://schemas.microsoft.com/office/word/2010/wordml" ns0:paraId="6472E9B2" ns0:textId="77777777">
+  <w:p xmlns:ns0="http://schemas.microsoft.com/office/word/2010/wordml" ns0:paraId="344354C4" ns0:textId="77777777">
     <w:r>
       <w:t>WordToolkit • test zaawansowany</w:t>
     </w:r>
@@ -6068,7 +6068,7 @@
 
 <file path=word/header3.xml><?xml version="1.0" encoding="utf-8"?>
 <w:hdr xmlns:w="http://schemas.openxmlformats.org/wordprocessingml/2006/main">
-  <w:p xmlns:ns0="http://schemas.microsoft.com/office/word/2010/wordml" ns0:paraId="2BAA4E06" ns0:textId="77777777">
+  <w:p xmlns:ns0="http://schemas.microsoft.com/office/word/2010/wordml" ns0:paraId="3C68383A" ns0:textId="77777777">
     <w:r>
       <w:t>WordToolkit • sekcja 1</w:t>
     </w:r>
@@ -6078,7 +6078,7 @@
 
 <file path=word/header4.xml><?xml version="1.0" encoding="utf-8"?>
 <w:hdr xmlns:w="http://schemas.openxmlformats.org/wordprocessingml/2006/main">
-  <w:p xmlns:ns0="http://schemas.microsoft.com/office/word/2010/wordml" ns0:paraId="53C98ACA" ns0:textId="77777777">
+  <w:p xmlns:ns0="http://schemas.microsoft.com/office/word/2010/wordml" ns0:paraId="7938C1CE" ns0:textId="77777777">
     <w:r>
       <w:t>WordToolkit • strona parzysta</w:t>
     </w:r>
@@ -6088,7 +6088,7 @@
 
 <file path=word/header5.xml><?xml version="1.0" encoding="utf-8"?>
 <w:hdr xmlns:w="http://schemas.openxmlformats.org/wordprocessingml/2006/main">
-  <w:p xmlns:ns0="http://schemas.microsoft.com/office/word/2010/wordml" ns0:paraId="0E92427B" ns0:textId="77777777">
+  <w:p xmlns:ns0="http://schemas.microsoft.com/office/word/2010/wordml" ns0:paraId="4EEAE6DD" ns0:textId="77777777">
     <w:r>
       <w:t>WordToolkit • test zaawansowany</w:t>
     </w:r>
@@ -6098,7 +6098,7 @@
 
 <file path=word/header6.xml><?xml version="1.0" encoding="utf-8"?>
 <w:hdr xmlns:w="http://schemas.openxmlformats.org/wordprocessingml/2006/main">
-  <w:p xmlns:ns0="http://schemas.microsoft.com/office/word/2010/wordml" ns0:paraId="41297885" ns0:textId="77777777">
+  <w:p xmlns:ns0="http://schemas.microsoft.com/office/word/2010/wordml" ns0:paraId="269F0412" ns0:textId="77777777">
     <w:r>
       <w:t>WordToolkit • sekcja 2</w:t>
     </w:r>
@@ -6108,7 +6108,7 @@
 
 <file path=word/header7.xml><?xml version="1.0" encoding="utf-8"?>
 <w:hdr xmlns:w="http://schemas.openxmlformats.org/wordprocessingml/2006/main">
-  <w:p xmlns:ns0="http://schemas.microsoft.com/office/word/2010/wordml" ns0:paraId="206C8C21" ns0:textId="77777777">
+  <w:p xmlns:ns0="http://schemas.microsoft.com/office/word/2010/wordml" ns0:paraId="0628C599" ns0:textId="77777777">
     <w:r>
       <w:t>WordToolkit • strona parzysta</w:t>
     </w:r>
@@ -6118,7 +6118,7 @@
 
 <file path=word/header8.xml><?xml version="1.0" encoding="utf-8"?>
 <w:hdr xmlns:w="http://schemas.openxmlformats.org/wordprocessingml/2006/main">
-  <w:p xmlns:ns0="http://schemas.microsoft.com/office/word/2010/wordml" ns0:paraId="05D585EB" ns0:textId="77777777">
+  <w:p xmlns:ns0="http://schemas.microsoft.com/office/word/2010/wordml" ns0:paraId="7B7FECA7" ns0:textId="77777777">
     <w:r>
       <w:t>WordToolkit • test zaawansowany</w:t>
     </w:r>
@@ -6128,7 +6128,7 @@
 
 <file path=word/header9.xml><?xml version="1.0" encoding="utf-8"?>
 <w:hdr xmlns:w="http://schemas.openxmlformats.org/wordprocessingml/2006/main">
-  <w:p xmlns:ns0="http://schemas.microsoft.com/office/word/2010/wordml" ns0:paraId="4BB43D2B" ns0:textId="77777777">
+  <w:p xmlns:ns0="http://schemas.microsoft.com/office/word/2010/wordml" ns0:paraId="762D4DE2" ns0:textId="77777777">
     <w:r>
       <w:t>WordToolkit • sekcja 3</w:t>
     </w:r>

</xml_diff>

<commit_message>
Add guarded footnote and endnote repair
</commit_message>
<xml_diff>
--- a/examples/advanced/WordToolkit-advanced-torture-test.docx
+++ b/examples/advanced/WordToolkit-advanced-torture-test.docx
@@ -146,12 +146,12 @@
       <w:r>
         <w:t xml:space="preserve">Rewizja testowa zmienia frazę wersja </w:t>
       </w:r>
-      <w:del w:id="1" w:author="WordToolkit QA" w:date="2026-07-25T22:47:45Z">
+      <w:del w:id="1" w:author="WordToolkit QA" w:date="2026-07-26T01:26:23Z">
         <w:r>
           <w:delText xml:space="preserve">robocza</w:delText>
         </w:r>
       </w:del>
-      <w:ins w:id="2" w:author="WordToolkit QA" w:date="2026-07-25T22:47:45Z">
+      <w:ins w:id="2" w:author="WordToolkit QA" w:date="2026-07-26T01:26:23Z">
         <w:r>
           <w:t xml:space="preserve">zatwierdzona</w:t>
         </w:r>
@@ -159,7 +159,7 @@
       <w:r>
         <w:t xml:space="preserve"> na wersja zatwierdzona i usuwa token </w:t>
       </w:r>
-      <w:del w:id="3" w:author="WordToolkit QA" w:date="2026-07-25T22:47:45Z">
+      <w:del w:id="3" w:author="WordToolkit QA" w:date="2026-07-26T01:26:23Z">
         <w:r>
           <w:delText xml:space="preserve">LEGACY</w:delText>
         </w:r>
@@ -300,7 +300,7 @@
       <w:tr>
         <w:trPr>
           <w:tblHeader/>
-          <w:ins w:id="4" w:author="WordToolkit QA" w:date="2026-07-25T22:47:45Z"/>
+          <w:ins w:id="4" w:author="WordToolkit QA" w:date="2026-07-26T01:26:23Z"/>
         </w:trPr>
         <w:tc>
           <w:tcPr>
@@ -441,7 +441,7 @@
       </w:tr>
       <w:tr>
         <w:trPr>
-          <w:ins w:id="5" w:author="WordToolkit QA" w:date="2026-07-25T22:47:45Z"/>
+          <w:ins w:id="5" w:author="WordToolkit QA" w:date="2026-07-26T01:26:23Z"/>
         </w:trPr>
         <w:tc>
           <w:tcPr>
@@ -550,7 +550,7 @@
       </w:tr>
       <w:tr>
         <w:trPr>
-          <w:ins w:id="6" w:author="WordToolkit QA" w:date="2026-07-25T22:47:45Z"/>
+          <w:ins w:id="6" w:author="WordToolkit QA" w:date="2026-07-26T01:26:23Z"/>
         </w:trPr>
         <w:tc>
           <w:tcPr>
@@ -659,7 +659,7 @@
       </w:tr>
       <w:tr>
         <w:trPr>
-          <w:ins w:id="7" w:author="WordToolkit QA" w:date="2026-07-25T22:47:45Z"/>
+          <w:ins w:id="7" w:author="WordToolkit QA" w:date="2026-07-26T01:26:23Z"/>
         </w:trPr>
         <w:tc>
           <w:tcPr>
@@ -768,7 +768,7 @@
       </w:tr>
       <w:tr>
         <w:trPr>
-          <w:ins w:id="8" w:author="WordToolkit QA" w:date="2026-07-25T22:47:45Z"/>
+          <w:ins w:id="8" w:author="WordToolkit QA" w:date="2026-07-26T01:26:23Z"/>
         </w:trPr>
         <w:tc>
           <w:tcPr>
@@ -877,7 +877,7 @@
       </w:tr>
       <w:tr>
         <w:trPr>
-          <w:ins w:id="9" w:author="WordToolkit QA" w:date="2026-07-25T22:47:45Z"/>
+          <w:ins w:id="9" w:author="WordToolkit QA" w:date="2026-07-26T01:26:23Z"/>
         </w:trPr>
         <w:tc>
           <w:tcPr>
@@ -986,7 +986,7 @@
       </w:tr>
       <w:tr>
         <w:trPr>
-          <w:ins w:id="10" w:author="WordToolkit QA" w:date="2026-07-25T22:47:45Z"/>
+          <w:ins w:id="10" w:author="WordToolkit QA" w:date="2026-07-26T01:26:23Z"/>
         </w:trPr>
         <w:tc>
           <w:tcPr>
@@ -1095,7 +1095,7 @@
       </w:tr>
       <w:tr>
         <w:trPr>
-          <w:ins w:id="11" w:author="WordToolkit QA" w:date="2026-07-25T22:47:45Z"/>
+          <w:ins w:id="11" w:author="WordToolkit QA" w:date="2026-07-26T01:26:23Z"/>
         </w:trPr>
         <w:tc>
           <w:tcPr>
@@ -1204,7 +1204,7 @@
       </w:tr>
       <w:tr>
         <w:trPr>
-          <w:ins w:id="12" w:author="WordToolkit QA" w:date="2026-07-25T22:47:45Z"/>
+          <w:ins w:id="12" w:author="WordToolkit QA" w:date="2026-07-26T01:26:23Z"/>
         </w:trPr>
         <w:tc>
           <w:tcPr>
@@ -1313,7 +1313,7 @@
       </w:tr>
       <w:tr>
         <w:trPr>
-          <w:ins w:id="13" w:author="WordToolkit QA" w:date="2026-07-25T22:47:45Z"/>
+          <w:ins w:id="13" w:author="WordToolkit QA" w:date="2026-07-26T01:26:23Z"/>
         </w:trPr>
         <w:tc>
           <w:tcPr>
@@ -1422,7 +1422,7 @@
       </w:tr>
       <w:tr>
         <w:trPr>
-          <w:ins w:id="14" w:author="WordToolkit QA" w:date="2026-07-25T22:47:45Z"/>
+          <w:ins w:id="14" w:author="WordToolkit QA" w:date="2026-07-26T01:26:23Z"/>
         </w:trPr>
         <w:tc>
           <w:tcPr>
@@ -1531,7 +1531,7 @@
       </w:tr>
       <w:tr>
         <w:trPr>
-          <w:ins w:id="15" w:author="WordToolkit QA" w:date="2026-07-25T22:47:45Z"/>
+          <w:ins w:id="15" w:author="WordToolkit QA" w:date="2026-07-26T01:26:23Z"/>
         </w:trPr>
         <w:tc>
           <w:tcPr>
@@ -1640,7 +1640,7 @@
       </w:tr>
       <w:tr>
         <w:trPr>
-          <w:ins w:id="16" w:author="WordToolkit QA" w:date="2026-07-25T22:47:45Z"/>
+          <w:ins w:id="16" w:author="WordToolkit QA" w:date="2026-07-26T01:26:23Z"/>
         </w:trPr>
         <w:tc>
           <w:tcPr>
@@ -1749,7 +1749,7 @@
       </w:tr>
       <w:tr>
         <w:trPr>
-          <w:ins w:id="17" w:author="WordToolkit QA" w:date="2026-07-25T22:47:45Z"/>
+          <w:ins w:id="17" w:author="WordToolkit QA" w:date="2026-07-26T01:26:23Z"/>
         </w:trPr>
         <w:tc>
           <w:tcPr>
@@ -1858,7 +1858,7 @@
       </w:tr>
       <w:tr>
         <w:trPr>
-          <w:ins w:id="18" w:author="WordToolkit QA" w:date="2026-07-25T22:47:45Z"/>
+          <w:ins w:id="18" w:author="WordToolkit QA" w:date="2026-07-26T01:26:23Z"/>
         </w:trPr>
         <w:tc>
           <w:tcPr>
@@ -1967,7 +1967,7 @@
       </w:tr>
       <w:tr>
         <w:trPr>
-          <w:ins w:id="19" w:author="WordToolkit QA" w:date="2026-07-25T22:47:45Z"/>
+          <w:ins w:id="19" w:author="WordToolkit QA" w:date="2026-07-26T01:26:23Z"/>
         </w:trPr>
         <w:tc>
           <w:tcPr>
@@ -2076,7 +2076,7 @@
       </w:tr>
       <w:tr>
         <w:trPr>
-          <w:ins w:id="20" w:author="WordToolkit QA" w:date="2026-07-25T22:47:45Z"/>
+          <w:ins w:id="20" w:author="WordToolkit QA" w:date="2026-07-26T01:26:23Z"/>
         </w:trPr>
         <w:tc>
           <w:tcPr>
@@ -2185,7 +2185,7 @@
       </w:tr>
       <w:tr>
         <w:trPr>
-          <w:ins w:id="21" w:author="WordToolkit QA" w:date="2026-07-25T22:47:45Z"/>
+          <w:ins w:id="21" w:author="WordToolkit QA" w:date="2026-07-26T01:26:23Z"/>
         </w:trPr>
         <w:tc>
           <w:tcPr>
@@ -2294,7 +2294,7 @@
       </w:tr>
       <w:tr>
         <w:trPr>
-          <w:ins w:id="22" w:author="WordToolkit QA" w:date="2026-07-25T22:47:45Z"/>
+          <w:ins w:id="22" w:author="WordToolkit QA" w:date="2026-07-26T01:26:23Z"/>
         </w:trPr>
         <w:tc>
           <w:tcPr>
@@ -2403,7 +2403,7 @@
       </w:tr>
       <w:tr>
         <w:trPr>
-          <w:ins w:id="23" w:author="WordToolkit QA" w:date="2026-07-25T22:47:45Z"/>
+          <w:ins w:id="23" w:author="WordToolkit QA" w:date="2026-07-26T01:26:23Z"/>
         </w:trPr>
         <w:tc>
           <w:tcPr>
@@ -2512,7 +2512,7 @@
       </w:tr>
       <w:tr>
         <w:trPr>
-          <w:ins w:id="24" w:author="WordToolkit QA" w:date="2026-07-25T22:47:45Z"/>
+          <w:ins w:id="24" w:author="WordToolkit QA" w:date="2026-07-26T01:26:23Z"/>
         </w:trPr>
         <w:tc>
           <w:tcPr>
@@ -2621,7 +2621,7 @@
       </w:tr>
       <w:tr>
         <w:trPr>
-          <w:ins w:id="25" w:author="WordToolkit QA" w:date="2026-07-25T22:47:45Z"/>
+          <w:ins w:id="25" w:author="WordToolkit QA" w:date="2026-07-26T01:26:23Z"/>
         </w:trPr>
         <w:tc>
           <w:tcPr>
@@ -2730,7 +2730,7 @@
       </w:tr>
       <w:tr>
         <w:trPr>
-          <w:ins w:id="26" w:author="WordToolkit QA" w:date="2026-07-25T22:47:45Z"/>
+          <w:ins w:id="26" w:author="WordToolkit QA" w:date="2026-07-26T01:26:23Z"/>
         </w:trPr>
         <w:tc>
           <w:tcPr>
@@ -2839,7 +2839,7 @@
       </w:tr>
       <w:tr>
         <w:trPr>
-          <w:ins w:id="27" w:author="WordToolkit QA" w:date="2026-07-25T22:47:45Z"/>
+          <w:ins w:id="27" w:author="WordToolkit QA" w:date="2026-07-26T01:26:23Z"/>
         </w:trPr>
         <w:tc>
           <w:tcPr>
@@ -2948,7 +2948,7 @@
       </w:tr>
       <w:tr>
         <w:trPr>
-          <w:ins w:id="28" w:author="WordToolkit QA" w:date="2026-07-25T22:47:45Z"/>
+          <w:ins w:id="28" w:author="WordToolkit QA" w:date="2026-07-26T01:26:23Z"/>
         </w:trPr>
         <w:tc>
           <w:tcPr>
@@ -3057,7 +3057,7 @@
       </w:tr>
       <w:tr>
         <w:trPr>
-          <w:ins w:id="29" w:author="WordToolkit QA" w:date="2026-07-25T22:47:45Z"/>
+          <w:ins w:id="29" w:author="WordToolkit QA" w:date="2026-07-26T01:26:23Z"/>
         </w:trPr>
         <w:tc>
           <w:tcPr>
@@ -3166,7 +3166,7 @@
       </w:tr>
       <w:tr>
         <w:trPr>
-          <w:ins w:id="30" w:author="WordToolkit QA" w:date="2026-07-25T22:47:45Z"/>
+          <w:ins w:id="30" w:author="WordToolkit QA" w:date="2026-07-26T01:26:23Z"/>
         </w:trPr>
         <w:tc>
           <w:tcPr>
@@ -3275,7 +3275,7 @@
       </w:tr>
       <w:tr>
         <w:trPr>
-          <w:ins w:id="31" w:author="WordToolkit QA" w:date="2026-07-25T22:47:45Z"/>
+          <w:ins w:id="31" w:author="WordToolkit QA" w:date="2026-07-26T01:26:23Z"/>
         </w:trPr>
         <w:tc>
           <w:tcPr>
@@ -3372,7 +3372,7 @@
       </w:tr>
       <w:tr>
         <w:trPr>
-          <w:ins w:id="32" w:author="WordToolkit QA" w:date="2026-07-25T22:47:45Z"/>
+          <w:ins w:id="32" w:author="WordToolkit QA" w:date="2026-07-26T01:26:23Z"/>
         </w:trPr>
         <w:tc>
           <w:tcPr>
@@ -3542,7 +3542,7 @@
       <w:tr>
         <w:trPr>
           <w:tblHeader/>
-          <w:ins w:id="33" w:author="WordToolkit QA" w:date="2026-07-25T22:47:46Z"/>
+          <w:ins w:id="33" w:author="WordToolkit QA" w:date="2026-07-26T01:26:23Z"/>
         </w:trPr>
         <w:tc>
           <w:tcPr>
@@ -3615,7 +3615,7 @@
       </w:tr>
       <w:tr>
         <w:trPr>
-          <w:ins w:id="34" w:author="WordToolkit QA" w:date="2026-07-25T22:47:46Z"/>
+          <w:ins w:id="34" w:author="WordToolkit QA" w:date="2026-07-26T01:26:23Z"/>
         </w:trPr>
         <w:tc>
           <w:tcPr>
@@ -3672,7 +3672,7 @@
       </w:tr>
       <w:tr>
         <w:trPr>
-          <w:ins w:id="35" w:author="WordToolkit QA" w:date="2026-07-25T22:47:46Z"/>
+          <w:ins w:id="35" w:author="WordToolkit QA" w:date="2026-07-26T01:26:23Z"/>
         </w:trPr>
         <w:tc>
           <w:tcPr>
@@ -3726,7 +3726,7 @@
       </w:tr>
       <w:tr>
         <w:trPr>
-          <w:ins w:id="36" w:author="WordToolkit QA" w:date="2026-07-25T22:47:46Z"/>
+          <w:ins w:id="36" w:author="WordToolkit QA" w:date="2026-07-26T01:26:23Z"/>
         </w:trPr>
         <w:tc>
           <w:tcPr>
@@ -3783,7 +3783,7 @@
       </w:tr>
       <w:tr>
         <w:trPr>
-          <w:ins w:id="37" w:author="WordToolkit QA" w:date="2026-07-25T22:47:46Z"/>
+          <w:ins w:id="37" w:author="WordToolkit QA" w:date="2026-07-26T01:26:23Z"/>
         </w:trPr>
         <w:tc>
           <w:tcPr>
@@ -5644,7 +5644,7 @@
 
 <file path=word/comments.xml><?xml version="1.0" encoding="utf-8"?>
 <w:comments xmlns:w="http://schemas.openxmlformats.org/wordprocessingml/2006/main" xmlns:w14="http://schemas.microsoft.com/office/word/2010/wordml" xmlns:r="http://schemas.openxmlformats.org/officeDocument/2006/relationships">
-  <w:comment w:id="0" w:author="Reviewer A" w:date="2026-07-25T22:47:45Z" w:initials="RA">
+  <w:comment w:id="0" w:author="Reviewer A" w:date="2026-07-26T01:26:23Z" w:initials="RA">
     <w:p>
       <w:r>
         <w:rPr>
@@ -5657,7 +5657,7 @@
       </w:r>
     </w:p>
   </w:comment>
-  <w:comment w:id="1" w:author="Reviewer B" w:date="2026-07-25T22:47:45Z" w:initials="RB">
+  <w:comment w:id="1" w:author="Reviewer B" w:date="2026-07-26T01:26:23Z" w:initials="RB">
     <w:p>
       <w:r>
         <w:t xml:space="preserve">Semantyka zweryfikowana.</w:t>
@@ -5669,8 +5669,8 @@
 
 <file path=word/commentsExtended.xml><?xml version="1.0" encoding="utf-8"?>
 <w15:commentsEx xmlns:w15="http://schemas.microsoft.com/office/word/2012/wordml" xmlns:w14="http://schemas.microsoft.com/office/word/2010/wordml">
-  <w15:commentEx w15:paraId="6CD49D5E" w15:done="0"/>
-  <w15:commentEx w15:paraId="36FD0962" w15:paraIdParent="6CD49D5E" w15:done="0"/>
+  <w15:commentEx w15:paraId="34979B9B" w15:done="0"/>
+  <w15:commentEx w15:paraId="184D0C63" w15:paraIdParent="34979B9B" w15:done="0"/>
 </w15:commentsEx>
 </file>
 
@@ -5702,7 +5702,7 @@
 
 <file path=word/footer1.xml><?xml version="1.0" encoding="utf-8"?>
 <w:ftr xmlns:w="http://schemas.openxmlformats.org/wordprocessingml/2006/main">
-  <w:p xmlns:ns0="http://schemas.microsoft.com/office/word/2010/wordml" ns0:paraId="2DC7AA3C" ns0:textId="77777777">
+  <w:p xmlns:ns0="http://schemas.microsoft.com/office/word/2010/wordml" ns0:paraId="6C8DE1C7" ns0:textId="77777777">
     <w:r>
       <w:t xml:space="preserve">WordToolkit • test zaawansowany • </w:t>
     </w:r>
@@ -5725,7 +5725,7 @@
 
 <file path=word/footer10.xml><?xml version="1.0" encoding="utf-8"?>
 <w:ftr xmlns:w="http://schemas.openxmlformats.org/wordprocessingml/2006/main">
-  <w:p xmlns:ns0="http://schemas.microsoft.com/office/word/2010/wordml" ns0:paraId="3BE50D70" ns0:textId="77777777">
+  <w:p xmlns:ns0="http://schemas.microsoft.com/office/word/2010/wordml" ns0:paraId="735A5850" ns0:textId="77777777">
     <w:r>
       <w:t xml:space="preserve">WordToolkit • test zaawansowany • </w:t>
     </w:r>
@@ -5748,7 +5748,7 @@
 
 <file path=word/footer11.xml><?xml version="1.0" encoding="utf-8"?>
 <w:ftr xmlns:w="http://schemas.openxmlformats.org/wordprocessingml/2006/main">
-  <w:p xmlns:ns0="http://schemas.microsoft.com/office/word/2010/wordml" ns0:paraId="133FFFBF" ns0:textId="77777777">
+  <w:p xmlns:ns0="http://schemas.microsoft.com/office/word/2010/wordml" ns0:paraId="7039B87F" ns0:textId="77777777">
     <w:r>
       <w:t xml:space="preserve">WordToolkit • sekcja 4 • </w:t>
     </w:r>
@@ -5771,7 +5771,7 @@
 
 <file path=word/footer12.xml><?xml version="1.0" encoding="utf-8"?>
 <w:ftr xmlns:w="http://schemas.openxmlformats.org/wordprocessingml/2006/main">
-  <w:p xmlns:ns0="http://schemas.microsoft.com/office/word/2010/wordml" ns0:paraId="5C848ECF" ns0:textId="77777777">
+  <w:p xmlns:ns0="http://schemas.microsoft.com/office/word/2010/wordml" ns0:paraId="5E2EED4F" ns0:textId="77777777">
     <w:r>
       <w:t xml:space="preserve">WordToolkit • strona parzysta • </w:t>
     </w:r>
@@ -5794,7 +5794,7 @@
 
 <file path=word/footer2.xml><?xml version="1.0" encoding="utf-8"?>
 <w:ftr xmlns:w="http://schemas.openxmlformats.org/wordprocessingml/2006/main">
-  <w:p xmlns:ns0="http://schemas.microsoft.com/office/word/2010/wordml" ns0:paraId="11F9B257" ns0:textId="77777777">
+  <w:p xmlns:ns0="http://schemas.microsoft.com/office/word/2010/wordml" ns0:paraId="6E6117F2" ns0:textId="77777777">
     <w:r>
       <w:t xml:space="preserve">WordToolkit • sekcja 1 • </w:t>
     </w:r>
@@ -5817,7 +5817,7 @@
 
 <file path=word/footer3.xml><?xml version="1.0" encoding="utf-8"?>
 <w:ftr xmlns:w="http://schemas.openxmlformats.org/wordprocessingml/2006/main">
-  <w:p xmlns:ns0="http://schemas.microsoft.com/office/word/2010/wordml" ns0:paraId="7970127A" ns0:textId="77777777">
+  <w:p xmlns:ns0="http://schemas.microsoft.com/office/word/2010/wordml" ns0:paraId="6E8105A8" ns0:textId="77777777">
     <w:r>
       <w:t xml:space="preserve">WordToolkit • strona parzysta • </w:t>
     </w:r>
@@ -5840,7 +5840,7 @@
 
 <file path=word/footer4.xml><?xml version="1.0" encoding="utf-8"?>
 <w:ftr xmlns:w="http://schemas.openxmlformats.org/wordprocessingml/2006/main">
-  <w:p xmlns:ns0="http://schemas.microsoft.com/office/word/2010/wordml" ns0:paraId="17DFB039" ns0:textId="77777777">
+  <w:p xmlns:ns0="http://schemas.microsoft.com/office/word/2010/wordml" ns0:paraId="7F8D6D12" ns0:textId="77777777">
     <w:r>
       <w:t xml:space="preserve">WordToolkit • test zaawansowany • </w:t>
     </w:r>
@@ -5863,7 +5863,7 @@
 
 <file path=word/footer5.xml><?xml version="1.0" encoding="utf-8"?>
 <w:ftr xmlns:w="http://schemas.openxmlformats.org/wordprocessingml/2006/main">
-  <w:p xmlns:ns0="http://schemas.microsoft.com/office/word/2010/wordml" ns0:paraId="0239A9CA" ns0:textId="77777777">
+  <w:p xmlns:ns0="http://schemas.microsoft.com/office/word/2010/wordml" ns0:paraId="2BD31437" ns0:textId="77777777">
     <w:r>
       <w:t xml:space="preserve">WordToolkit • sekcja 2 • </w:t>
     </w:r>
@@ -5886,7 +5886,7 @@
 
 <file path=word/footer6.xml><?xml version="1.0" encoding="utf-8"?>
 <w:ftr xmlns:w="http://schemas.openxmlformats.org/wordprocessingml/2006/main">
-  <w:p xmlns:ns0="http://schemas.microsoft.com/office/word/2010/wordml" ns0:paraId="23AD38E6" ns0:textId="77777777">
+  <w:p xmlns:ns0="http://schemas.microsoft.com/office/word/2010/wordml" ns0:paraId="6D970CE2" ns0:textId="77777777">
     <w:r>
       <w:t xml:space="preserve">WordToolkit • strona parzysta • </w:t>
     </w:r>
@@ -5909,7 +5909,7 @@
 
 <file path=word/footer7.xml><?xml version="1.0" encoding="utf-8"?>
 <w:ftr xmlns:w="http://schemas.openxmlformats.org/wordprocessingml/2006/main">
-  <w:p xmlns:ns0="http://schemas.microsoft.com/office/word/2010/wordml" ns0:paraId="3813B4EC" ns0:textId="77777777">
+  <w:p xmlns:ns0="http://schemas.microsoft.com/office/word/2010/wordml" ns0:paraId="2CBB0E69" ns0:textId="77777777">
     <w:r>
       <w:t xml:space="preserve">WordToolkit • test zaawansowany • </w:t>
     </w:r>
@@ -5932,7 +5932,7 @@
 
 <file path=word/footer8.xml><?xml version="1.0" encoding="utf-8"?>
 <w:ftr xmlns:w="http://schemas.openxmlformats.org/wordprocessingml/2006/main">
-  <w:p xmlns:ns0="http://schemas.microsoft.com/office/word/2010/wordml" ns0:paraId="0BB04A47" ns0:textId="77777777">
+  <w:p xmlns:ns0="http://schemas.microsoft.com/office/word/2010/wordml" ns0:paraId="6DD74E98" ns0:textId="77777777">
     <w:r>
       <w:t xml:space="preserve">WordToolkit • sekcja 3 • </w:t>
     </w:r>
@@ -5955,7 +5955,7 @@
 
 <file path=word/footer9.xml><?xml version="1.0" encoding="utf-8"?>
 <w:ftr xmlns:w="http://schemas.openxmlformats.org/wordprocessingml/2006/main">
-  <w:p xmlns:ns0="http://schemas.microsoft.com/office/word/2010/wordml" ns0:paraId="43CF3990" ns0:textId="77777777">
+  <w:p xmlns:ns0="http://schemas.microsoft.com/office/word/2010/wordml" ns0:paraId="27FF3376" ns0:textId="77777777">
     <w:r>
       <w:t xml:space="preserve">WordToolkit • strona parzysta • </w:t>
     </w:r>
@@ -6028,7 +6028,7 @@
 
 <file path=word/header10.xml><?xml version="1.0" encoding="utf-8"?>
 <w:hdr xmlns:w="http://schemas.openxmlformats.org/wordprocessingml/2006/main">
-  <w:p xmlns:ns0="http://schemas.microsoft.com/office/word/2010/wordml" ns0:paraId="0B14D23F" ns0:textId="77777777">
+  <w:p xmlns:ns0="http://schemas.microsoft.com/office/word/2010/wordml" ns0:paraId="5235BAB2" ns0:textId="77777777">
     <w:r>
       <w:t>WordToolkit • strona parzysta</w:t>
     </w:r>
@@ -6038,7 +6038,7 @@
 
 <file path=word/header11.xml><?xml version="1.0" encoding="utf-8"?>
 <w:hdr xmlns:w="http://schemas.openxmlformats.org/wordprocessingml/2006/main">
-  <w:p xmlns:ns0="http://schemas.microsoft.com/office/word/2010/wordml" ns0:paraId="72B54ED7" ns0:textId="77777777">
+  <w:p xmlns:ns0="http://schemas.microsoft.com/office/word/2010/wordml" ns0:paraId="572A7FBD" ns0:textId="77777777">
     <w:r>
       <w:t>WordToolkit • sekcja 4</w:t>
     </w:r>
@@ -6048,7 +6048,7 @@
 
 <file path=word/header12.xml><?xml version="1.0" encoding="utf-8"?>
 <w:hdr xmlns:w="http://schemas.openxmlformats.org/wordprocessingml/2006/main">
-  <w:p xmlns:ns0="http://schemas.microsoft.com/office/word/2010/wordml" ns0:paraId="1A474B4C" ns0:textId="77777777">
+  <w:p xmlns:ns0="http://schemas.microsoft.com/office/word/2010/wordml" ns0:paraId="53BED189" ns0:textId="77777777">
     <w:r>
       <w:t>WordToolkit • strona parzysta</w:t>
     </w:r>
@@ -6058,7 +6058,7 @@
 
 <file path=word/header2.xml><?xml version="1.0" encoding="utf-8"?>
 <w:hdr xmlns:w="http://schemas.openxmlformats.org/wordprocessingml/2006/main">
-  <w:p xmlns:ns0="http://schemas.microsoft.com/office/word/2010/wordml" ns0:paraId="344354C4" ns0:textId="77777777">
+  <w:p xmlns:ns0="http://schemas.microsoft.com/office/word/2010/wordml" ns0:paraId="66AEBA7E" ns0:textId="77777777">
     <w:r>
       <w:t>WordToolkit • test zaawansowany</w:t>
     </w:r>
@@ -6068,7 +6068,7 @@
 
 <file path=word/header3.xml><?xml version="1.0" encoding="utf-8"?>
 <w:hdr xmlns:w="http://schemas.openxmlformats.org/wordprocessingml/2006/main">
-  <w:p xmlns:ns0="http://schemas.microsoft.com/office/word/2010/wordml" ns0:paraId="3C68383A" ns0:textId="77777777">
+  <w:p xmlns:ns0="http://schemas.microsoft.com/office/word/2010/wordml" ns0:paraId="27021435" ns0:textId="77777777">
     <w:r>
       <w:t>WordToolkit • sekcja 1</w:t>
     </w:r>
@@ -6078,7 +6078,7 @@
 
 <file path=word/header4.xml><?xml version="1.0" encoding="utf-8"?>
 <w:hdr xmlns:w="http://schemas.openxmlformats.org/wordprocessingml/2006/main">
-  <w:p xmlns:ns0="http://schemas.microsoft.com/office/word/2010/wordml" ns0:paraId="7938C1CE" ns0:textId="77777777">
+  <w:p xmlns:ns0="http://schemas.microsoft.com/office/word/2010/wordml" ns0:paraId="42C2B58A" ns0:textId="77777777">
     <w:r>
       <w:t>WordToolkit • strona parzysta</w:t>
     </w:r>
@@ -6088,7 +6088,7 @@
 
 <file path=word/header5.xml><?xml version="1.0" encoding="utf-8"?>
 <w:hdr xmlns:w="http://schemas.openxmlformats.org/wordprocessingml/2006/main">
-  <w:p xmlns:ns0="http://schemas.microsoft.com/office/word/2010/wordml" ns0:paraId="4EEAE6DD" ns0:textId="77777777">
+  <w:p xmlns:ns0="http://schemas.microsoft.com/office/word/2010/wordml" ns0:paraId="46D98D87" ns0:textId="77777777">
     <w:r>
       <w:t>WordToolkit • test zaawansowany</w:t>
     </w:r>
@@ -6098,7 +6098,7 @@
 
 <file path=word/header6.xml><?xml version="1.0" encoding="utf-8"?>
 <w:hdr xmlns:w="http://schemas.openxmlformats.org/wordprocessingml/2006/main">
-  <w:p xmlns:ns0="http://schemas.microsoft.com/office/word/2010/wordml" ns0:paraId="269F0412" ns0:textId="77777777">
+  <w:p xmlns:ns0="http://schemas.microsoft.com/office/word/2010/wordml" ns0:paraId="5FC74444" ns0:textId="77777777">
     <w:r>
       <w:t>WordToolkit • sekcja 2</w:t>
     </w:r>
@@ -6108,7 +6108,7 @@
 
 <file path=word/header7.xml><?xml version="1.0" encoding="utf-8"?>
 <w:hdr xmlns:w="http://schemas.openxmlformats.org/wordprocessingml/2006/main">
-  <w:p xmlns:ns0="http://schemas.microsoft.com/office/word/2010/wordml" ns0:paraId="0628C599" ns0:textId="77777777">
+  <w:p xmlns:ns0="http://schemas.microsoft.com/office/word/2010/wordml" ns0:paraId="1F0466A9" ns0:textId="77777777">
     <w:r>
       <w:t>WordToolkit • strona parzysta</w:t>
     </w:r>
@@ -6118,7 +6118,7 @@
 
 <file path=word/header8.xml><?xml version="1.0" encoding="utf-8"?>
 <w:hdr xmlns:w="http://schemas.openxmlformats.org/wordprocessingml/2006/main">
-  <w:p xmlns:ns0="http://schemas.microsoft.com/office/word/2010/wordml" ns0:paraId="7B7FECA7" ns0:textId="77777777">
+  <w:p xmlns:ns0="http://schemas.microsoft.com/office/word/2010/wordml" ns0:paraId="07726F1C" ns0:textId="77777777">
     <w:r>
       <w:t>WordToolkit • test zaawansowany</w:t>
     </w:r>
@@ -6128,7 +6128,7 @@
 
 <file path=word/header9.xml><?xml version="1.0" encoding="utf-8"?>
 <w:hdr xmlns:w="http://schemas.openxmlformats.org/wordprocessingml/2006/main">
-  <w:p xmlns:ns0="http://schemas.microsoft.com/office/word/2010/wordml" ns0:paraId="762D4DE2" ns0:textId="77777777">
+  <w:p xmlns:ns0="http://schemas.microsoft.com/office/word/2010/wordml" ns0:paraId="71F8171A" ns0:textId="77777777">
     <w:r>
       <w:t>WordToolkit • sekcja 3</w:t>
     </w:r>

</xml_diff>

<commit_message>
Add guarded OfficeMath duplicate repair
</commit_message>
<xml_diff>
--- a/examples/advanced/WordToolkit-advanced-torture-test.docx
+++ b/examples/advanced/WordToolkit-advanced-torture-test.docx
@@ -146,12 +146,12 @@
       <w:r>
         <w:t xml:space="preserve">Rewizja testowa zmienia frazę wersja </w:t>
       </w:r>
-      <w:del w:id="1" w:author="WordToolkit QA" w:date="2026-07-26T01:26:23Z">
+      <w:del w:id="1" w:author="WordToolkit QA" w:date="2026-07-26T03:19:45Z">
         <w:r>
           <w:delText xml:space="preserve">robocza</w:delText>
         </w:r>
       </w:del>
-      <w:ins w:id="2" w:author="WordToolkit QA" w:date="2026-07-26T01:26:23Z">
+      <w:ins w:id="2" w:author="WordToolkit QA" w:date="2026-07-26T03:19:45Z">
         <w:r>
           <w:t xml:space="preserve">zatwierdzona</w:t>
         </w:r>
@@ -159,7 +159,7 @@
       <w:r>
         <w:t xml:space="preserve"> na wersja zatwierdzona i usuwa token </w:t>
       </w:r>
-      <w:del w:id="3" w:author="WordToolkit QA" w:date="2026-07-26T01:26:23Z">
+      <w:del w:id="3" w:author="WordToolkit QA" w:date="2026-07-26T03:19:45Z">
         <w:r>
           <w:delText xml:space="preserve">LEGACY</w:delText>
         </w:r>
@@ -300,7 +300,7 @@
       <w:tr>
         <w:trPr>
           <w:tblHeader/>
-          <w:ins w:id="4" w:author="WordToolkit QA" w:date="2026-07-26T01:26:23Z"/>
+          <w:ins w:id="4" w:author="WordToolkit QA" w:date="2026-07-26T03:19:45Z"/>
         </w:trPr>
         <w:tc>
           <w:tcPr>
@@ -441,7 +441,7 @@
       </w:tr>
       <w:tr>
         <w:trPr>
-          <w:ins w:id="5" w:author="WordToolkit QA" w:date="2026-07-26T01:26:23Z"/>
+          <w:ins w:id="5" w:author="WordToolkit QA" w:date="2026-07-26T03:19:45Z"/>
         </w:trPr>
         <w:tc>
           <w:tcPr>
@@ -550,7 +550,7 @@
       </w:tr>
       <w:tr>
         <w:trPr>
-          <w:ins w:id="6" w:author="WordToolkit QA" w:date="2026-07-26T01:26:23Z"/>
+          <w:ins w:id="6" w:author="WordToolkit QA" w:date="2026-07-26T03:19:45Z"/>
         </w:trPr>
         <w:tc>
           <w:tcPr>
@@ -659,7 +659,7 @@
       </w:tr>
       <w:tr>
         <w:trPr>
-          <w:ins w:id="7" w:author="WordToolkit QA" w:date="2026-07-26T01:26:23Z"/>
+          <w:ins w:id="7" w:author="WordToolkit QA" w:date="2026-07-26T03:19:45Z"/>
         </w:trPr>
         <w:tc>
           <w:tcPr>
@@ -768,7 +768,7 @@
       </w:tr>
       <w:tr>
         <w:trPr>
-          <w:ins w:id="8" w:author="WordToolkit QA" w:date="2026-07-26T01:26:23Z"/>
+          <w:ins w:id="8" w:author="WordToolkit QA" w:date="2026-07-26T03:19:45Z"/>
         </w:trPr>
         <w:tc>
           <w:tcPr>
@@ -877,7 +877,7 @@
       </w:tr>
       <w:tr>
         <w:trPr>
-          <w:ins w:id="9" w:author="WordToolkit QA" w:date="2026-07-26T01:26:23Z"/>
+          <w:ins w:id="9" w:author="WordToolkit QA" w:date="2026-07-26T03:19:45Z"/>
         </w:trPr>
         <w:tc>
           <w:tcPr>
@@ -986,7 +986,7 @@
       </w:tr>
       <w:tr>
         <w:trPr>
-          <w:ins w:id="10" w:author="WordToolkit QA" w:date="2026-07-26T01:26:23Z"/>
+          <w:ins w:id="10" w:author="WordToolkit QA" w:date="2026-07-26T03:19:45Z"/>
         </w:trPr>
         <w:tc>
           <w:tcPr>
@@ -1095,7 +1095,7 @@
       </w:tr>
       <w:tr>
         <w:trPr>
-          <w:ins w:id="11" w:author="WordToolkit QA" w:date="2026-07-26T01:26:23Z"/>
+          <w:ins w:id="11" w:author="WordToolkit QA" w:date="2026-07-26T03:19:45Z"/>
         </w:trPr>
         <w:tc>
           <w:tcPr>
@@ -1204,7 +1204,7 @@
       </w:tr>
       <w:tr>
         <w:trPr>
-          <w:ins w:id="12" w:author="WordToolkit QA" w:date="2026-07-26T01:26:23Z"/>
+          <w:ins w:id="12" w:author="WordToolkit QA" w:date="2026-07-26T03:19:45Z"/>
         </w:trPr>
         <w:tc>
           <w:tcPr>
@@ -1313,7 +1313,7 @@
       </w:tr>
       <w:tr>
         <w:trPr>
-          <w:ins w:id="13" w:author="WordToolkit QA" w:date="2026-07-26T01:26:23Z"/>
+          <w:ins w:id="13" w:author="WordToolkit QA" w:date="2026-07-26T03:19:45Z"/>
         </w:trPr>
         <w:tc>
           <w:tcPr>
@@ -1422,7 +1422,7 @@
       </w:tr>
       <w:tr>
         <w:trPr>
-          <w:ins w:id="14" w:author="WordToolkit QA" w:date="2026-07-26T01:26:23Z"/>
+          <w:ins w:id="14" w:author="WordToolkit QA" w:date="2026-07-26T03:19:45Z"/>
         </w:trPr>
         <w:tc>
           <w:tcPr>
@@ -1531,7 +1531,7 @@
       </w:tr>
       <w:tr>
         <w:trPr>
-          <w:ins w:id="15" w:author="WordToolkit QA" w:date="2026-07-26T01:26:23Z"/>
+          <w:ins w:id="15" w:author="WordToolkit QA" w:date="2026-07-26T03:19:45Z"/>
         </w:trPr>
         <w:tc>
           <w:tcPr>
@@ -1640,7 +1640,7 @@
       </w:tr>
       <w:tr>
         <w:trPr>
-          <w:ins w:id="16" w:author="WordToolkit QA" w:date="2026-07-26T01:26:23Z"/>
+          <w:ins w:id="16" w:author="WordToolkit QA" w:date="2026-07-26T03:19:45Z"/>
         </w:trPr>
         <w:tc>
           <w:tcPr>
@@ -1749,7 +1749,7 @@
       </w:tr>
       <w:tr>
         <w:trPr>
-          <w:ins w:id="17" w:author="WordToolkit QA" w:date="2026-07-26T01:26:23Z"/>
+          <w:ins w:id="17" w:author="WordToolkit QA" w:date="2026-07-26T03:19:45Z"/>
         </w:trPr>
         <w:tc>
           <w:tcPr>
@@ -1858,7 +1858,7 @@
       </w:tr>
       <w:tr>
         <w:trPr>
-          <w:ins w:id="18" w:author="WordToolkit QA" w:date="2026-07-26T01:26:23Z"/>
+          <w:ins w:id="18" w:author="WordToolkit QA" w:date="2026-07-26T03:19:45Z"/>
         </w:trPr>
         <w:tc>
           <w:tcPr>
@@ -1967,7 +1967,7 @@
       </w:tr>
       <w:tr>
         <w:trPr>
-          <w:ins w:id="19" w:author="WordToolkit QA" w:date="2026-07-26T01:26:23Z"/>
+          <w:ins w:id="19" w:author="WordToolkit QA" w:date="2026-07-26T03:19:45Z"/>
         </w:trPr>
         <w:tc>
           <w:tcPr>
@@ -2076,7 +2076,7 @@
       </w:tr>
       <w:tr>
         <w:trPr>
-          <w:ins w:id="20" w:author="WordToolkit QA" w:date="2026-07-26T01:26:23Z"/>
+          <w:ins w:id="20" w:author="WordToolkit QA" w:date="2026-07-26T03:19:45Z"/>
         </w:trPr>
         <w:tc>
           <w:tcPr>
@@ -2185,7 +2185,7 @@
       </w:tr>
       <w:tr>
         <w:trPr>
-          <w:ins w:id="21" w:author="WordToolkit QA" w:date="2026-07-26T01:26:23Z"/>
+          <w:ins w:id="21" w:author="WordToolkit QA" w:date="2026-07-26T03:19:45Z"/>
         </w:trPr>
         <w:tc>
           <w:tcPr>
@@ -2294,7 +2294,7 @@
       </w:tr>
       <w:tr>
         <w:trPr>
-          <w:ins w:id="22" w:author="WordToolkit QA" w:date="2026-07-26T01:26:23Z"/>
+          <w:ins w:id="22" w:author="WordToolkit QA" w:date="2026-07-26T03:19:45Z"/>
         </w:trPr>
         <w:tc>
           <w:tcPr>
@@ -2403,7 +2403,7 @@
       </w:tr>
       <w:tr>
         <w:trPr>
-          <w:ins w:id="23" w:author="WordToolkit QA" w:date="2026-07-26T01:26:23Z"/>
+          <w:ins w:id="23" w:author="WordToolkit QA" w:date="2026-07-26T03:19:45Z"/>
         </w:trPr>
         <w:tc>
           <w:tcPr>
@@ -2512,7 +2512,7 @@
       </w:tr>
       <w:tr>
         <w:trPr>
-          <w:ins w:id="24" w:author="WordToolkit QA" w:date="2026-07-26T01:26:23Z"/>
+          <w:ins w:id="24" w:author="WordToolkit QA" w:date="2026-07-26T03:19:45Z"/>
         </w:trPr>
         <w:tc>
           <w:tcPr>
@@ -2621,7 +2621,7 @@
       </w:tr>
       <w:tr>
         <w:trPr>
-          <w:ins w:id="25" w:author="WordToolkit QA" w:date="2026-07-26T01:26:23Z"/>
+          <w:ins w:id="25" w:author="WordToolkit QA" w:date="2026-07-26T03:19:45Z"/>
         </w:trPr>
         <w:tc>
           <w:tcPr>
@@ -2730,7 +2730,7 @@
       </w:tr>
       <w:tr>
         <w:trPr>
-          <w:ins w:id="26" w:author="WordToolkit QA" w:date="2026-07-26T01:26:23Z"/>
+          <w:ins w:id="26" w:author="WordToolkit QA" w:date="2026-07-26T03:19:45Z"/>
         </w:trPr>
         <w:tc>
           <w:tcPr>
@@ -2839,7 +2839,7 @@
       </w:tr>
       <w:tr>
         <w:trPr>
-          <w:ins w:id="27" w:author="WordToolkit QA" w:date="2026-07-26T01:26:23Z"/>
+          <w:ins w:id="27" w:author="WordToolkit QA" w:date="2026-07-26T03:19:45Z"/>
         </w:trPr>
         <w:tc>
           <w:tcPr>
@@ -2948,7 +2948,7 @@
       </w:tr>
       <w:tr>
         <w:trPr>
-          <w:ins w:id="28" w:author="WordToolkit QA" w:date="2026-07-26T01:26:23Z"/>
+          <w:ins w:id="28" w:author="WordToolkit QA" w:date="2026-07-26T03:19:45Z"/>
         </w:trPr>
         <w:tc>
           <w:tcPr>
@@ -3057,7 +3057,7 @@
       </w:tr>
       <w:tr>
         <w:trPr>
-          <w:ins w:id="29" w:author="WordToolkit QA" w:date="2026-07-26T01:26:23Z"/>
+          <w:ins w:id="29" w:author="WordToolkit QA" w:date="2026-07-26T03:19:45Z"/>
         </w:trPr>
         <w:tc>
           <w:tcPr>
@@ -3166,7 +3166,7 @@
       </w:tr>
       <w:tr>
         <w:trPr>
-          <w:ins w:id="30" w:author="WordToolkit QA" w:date="2026-07-26T01:26:23Z"/>
+          <w:ins w:id="30" w:author="WordToolkit QA" w:date="2026-07-26T03:19:45Z"/>
         </w:trPr>
         <w:tc>
           <w:tcPr>
@@ -3275,7 +3275,7 @@
       </w:tr>
       <w:tr>
         <w:trPr>
-          <w:ins w:id="31" w:author="WordToolkit QA" w:date="2026-07-26T01:26:23Z"/>
+          <w:ins w:id="31" w:author="WordToolkit QA" w:date="2026-07-26T03:19:45Z"/>
         </w:trPr>
         <w:tc>
           <w:tcPr>
@@ -3372,7 +3372,7 @@
       </w:tr>
       <w:tr>
         <w:trPr>
-          <w:ins w:id="32" w:author="WordToolkit QA" w:date="2026-07-26T01:26:23Z"/>
+          <w:ins w:id="32" w:author="WordToolkit QA" w:date="2026-07-26T03:19:45Z"/>
         </w:trPr>
         <w:tc>
           <w:tcPr>
@@ -3542,7 +3542,7 @@
       <w:tr>
         <w:trPr>
           <w:tblHeader/>
-          <w:ins w:id="33" w:author="WordToolkit QA" w:date="2026-07-26T01:26:23Z"/>
+          <w:ins w:id="33" w:author="WordToolkit QA" w:date="2026-07-26T03:19:45Z"/>
         </w:trPr>
         <w:tc>
           <w:tcPr>
@@ -3615,7 +3615,7 @@
       </w:tr>
       <w:tr>
         <w:trPr>
-          <w:ins w:id="34" w:author="WordToolkit QA" w:date="2026-07-26T01:26:23Z"/>
+          <w:ins w:id="34" w:author="WordToolkit QA" w:date="2026-07-26T03:19:45Z"/>
         </w:trPr>
         <w:tc>
           <w:tcPr>
@@ -3672,7 +3672,7 @@
       </w:tr>
       <w:tr>
         <w:trPr>
-          <w:ins w:id="35" w:author="WordToolkit QA" w:date="2026-07-26T01:26:23Z"/>
+          <w:ins w:id="35" w:author="WordToolkit QA" w:date="2026-07-26T03:19:45Z"/>
         </w:trPr>
         <w:tc>
           <w:tcPr>
@@ -3726,7 +3726,7 @@
       </w:tr>
       <w:tr>
         <w:trPr>
-          <w:ins w:id="36" w:author="WordToolkit QA" w:date="2026-07-26T01:26:23Z"/>
+          <w:ins w:id="36" w:author="WordToolkit QA" w:date="2026-07-26T03:19:45Z"/>
         </w:trPr>
         <w:tc>
           <w:tcPr>
@@ -3783,7 +3783,7 @@
       </w:tr>
       <w:tr>
         <w:trPr>
-          <w:ins w:id="37" w:author="WordToolkit QA" w:date="2026-07-26T01:26:23Z"/>
+          <w:ins w:id="37" w:author="WordToolkit QA" w:date="2026-07-26T03:19:45Z"/>
         </w:trPr>
         <w:tc>
           <w:tcPr>
@@ -5644,7 +5644,7 @@
 
 <file path=word/comments.xml><?xml version="1.0" encoding="utf-8"?>
 <w:comments xmlns:w="http://schemas.openxmlformats.org/wordprocessingml/2006/main" xmlns:w14="http://schemas.microsoft.com/office/word/2010/wordml" xmlns:r="http://schemas.openxmlformats.org/officeDocument/2006/relationships">
-  <w:comment w:id="0" w:author="Reviewer A" w:date="2026-07-26T01:26:23Z" w:initials="RA">
+  <w:comment w:id="0" w:author="Reviewer A" w:date="2026-07-26T03:19:45Z" w:initials="RA">
     <w:p>
       <w:r>
         <w:rPr>
@@ -5657,7 +5657,7 @@
       </w:r>
     </w:p>
   </w:comment>
-  <w:comment w:id="1" w:author="Reviewer B" w:date="2026-07-26T01:26:23Z" w:initials="RB">
+  <w:comment w:id="1" w:author="Reviewer B" w:date="2026-07-26T03:19:45Z" w:initials="RB">
     <w:p>
       <w:r>
         <w:t xml:space="preserve">Semantyka zweryfikowana.</w:t>
@@ -5669,8 +5669,8 @@
 
 <file path=word/commentsExtended.xml><?xml version="1.0" encoding="utf-8"?>
 <w15:commentsEx xmlns:w15="http://schemas.microsoft.com/office/word/2012/wordml" xmlns:w14="http://schemas.microsoft.com/office/word/2010/wordml">
-  <w15:commentEx w15:paraId="34979B9B" w15:done="0"/>
-  <w15:commentEx w15:paraId="184D0C63" w15:paraIdParent="34979B9B" w15:done="0"/>
+  <w15:commentEx w15:paraId="78A62C11" w15:done="0"/>
+  <w15:commentEx w15:paraId="71934C9F" w15:paraIdParent="78A62C11" w15:done="0"/>
 </w15:commentsEx>
 </file>
 
@@ -5702,7 +5702,7 @@
 
 <file path=word/footer1.xml><?xml version="1.0" encoding="utf-8"?>
 <w:ftr xmlns:w="http://schemas.openxmlformats.org/wordprocessingml/2006/main">
-  <w:p xmlns:ns0="http://schemas.microsoft.com/office/word/2010/wordml" ns0:paraId="6C8DE1C7" ns0:textId="77777777">
+  <w:p xmlns:ns0="http://schemas.microsoft.com/office/word/2010/wordml" ns0:paraId="2C470865" ns0:textId="77777777">
     <w:r>
       <w:t xml:space="preserve">WordToolkit • test zaawansowany • </w:t>
     </w:r>
@@ -5725,7 +5725,7 @@
 
 <file path=word/footer10.xml><?xml version="1.0" encoding="utf-8"?>
 <w:ftr xmlns:w="http://schemas.openxmlformats.org/wordprocessingml/2006/main">
-  <w:p xmlns:ns0="http://schemas.microsoft.com/office/word/2010/wordml" ns0:paraId="735A5850" ns0:textId="77777777">
+  <w:p xmlns:ns0="http://schemas.microsoft.com/office/word/2010/wordml" ns0:paraId="1FCA0F59" ns0:textId="77777777">
     <w:r>
       <w:t xml:space="preserve">WordToolkit • test zaawansowany • </w:t>
     </w:r>
@@ -5748,7 +5748,7 @@
 
 <file path=word/footer11.xml><?xml version="1.0" encoding="utf-8"?>
 <w:ftr xmlns:w="http://schemas.openxmlformats.org/wordprocessingml/2006/main">
-  <w:p xmlns:ns0="http://schemas.microsoft.com/office/word/2010/wordml" ns0:paraId="7039B87F" ns0:textId="77777777">
+  <w:p xmlns:ns0="http://schemas.microsoft.com/office/word/2010/wordml" ns0:paraId="6A528D7F" ns0:textId="77777777">
     <w:r>
       <w:t xml:space="preserve">WordToolkit • sekcja 4 • </w:t>
     </w:r>
@@ -5771,7 +5771,7 @@
 
 <file path=word/footer12.xml><?xml version="1.0" encoding="utf-8"?>
 <w:ftr xmlns:w="http://schemas.openxmlformats.org/wordprocessingml/2006/main">
-  <w:p xmlns:ns0="http://schemas.microsoft.com/office/word/2010/wordml" ns0:paraId="5E2EED4F" ns0:textId="77777777">
+  <w:p xmlns:ns0="http://schemas.microsoft.com/office/word/2010/wordml" ns0:paraId="1EC2AAD4" ns0:textId="77777777">
     <w:r>
       <w:t xml:space="preserve">WordToolkit • strona parzysta • </w:t>
     </w:r>
@@ -5794,7 +5794,7 @@
 
 <file path=word/footer2.xml><?xml version="1.0" encoding="utf-8"?>
 <w:ftr xmlns:w="http://schemas.openxmlformats.org/wordprocessingml/2006/main">
-  <w:p xmlns:ns0="http://schemas.microsoft.com/office/word/2010/wordml" ns0:paraId="6E6117F2" ns0:textId="77777777">
+  <w:p xmlns:ns0="http://schemas.microsoft.com/office/word/2010/wordml" ns0:paraId="586B48E6" ns0:textId="77777777">
     <w:r>
       <w:t xml:space="preserve">WordToolkit • sekcja 1 • </w:t>
     </w:r>
@@ -5817,7 +5817,7 @@
 
 <file path=word/footer3.xml><?xml version="1.0" encoding="utf-8"?>
 <w:ftr xmlns:w="http://schemas.openxmlformats.org/wordprocessingml/2006/main">
-  <w:p xmlns:ns0="http://schemas.microsoft.com/office/word/2010/wordml" ns0:paraId="6E8105A8" ns0:textId="77777777">
+  <w:p xmlns:ns0="http://schemas.microsoft.com/office/word/2010/wordml" ns0:paraId="1331529B" ns0:textId="77777777">
     <w:r>
       <w:t xml:space="preserve">WordToolkit • strona parzysta • </w:t>
     </w:r>
@@ -5840,7 +5840,7 @@
 
 <file path=word/footer4.xml><?xml version="1.0" encoding="utf-8"?>
 <w:ftr xmlns:w="http://schemas.openxmlformats.org/wordprocessingml/2006/main">
-  <w:p xmlns:ns0="http://schemas.microsoft.com/office/word/2010/wordml" ns0:paraId="7F8D6D12" ns0:textId="77777777">
+  <w:p xmlns:ns0="http://schemas.microsoft.com/office/word/2010/wordml" ns0:paraId="09F6620C" ns0:textId="77777777">
     <w:r>
       <w:t xml:space="preserve">WordToolkit • test zaawansowany • </w:t>
     </w:r>
@@ -5863,7 +5863,7 @@
 
 <file path=word/footer5.xml><?xml version="1.0" encoding="utf-8"?>
 <w:ftr xmlns:w="http://schemas.openxmlformats.org/wordprocessingml/2006/main">
-  <w:p xmlns:ns0="http://schemas.microsoft.com/office/word/2010/wordml" ns0:paraId="2BD31437" ns0:textId="77777777">
+  <w:p xmlns:ns0="http://schemas.microsoft.com/office/word/2010/wordml" ns0:paraId="671612E8" ns0:textId="77777777">
     <w:r>
       <w:t xml:space="preserve">WordToolkit • sekcja 2 • </w:t>
     </w:r>
@@ -5886,7 +5886,7 @@
 
 <file path=word/footer6.xml><?xml version="1.0" encoding="utf-8"?>
 <w:ftr xmlns:w="http://schemas.openxmlformats.org/wordprocessingml/2006/main">
-  <w:p xmlns:ns0="http://schemas.microsoft.com/office/word/2010/wordml" ns0:paraId="6D970CE2" ns0:textId="77777777">
+  <w:p xmlns:ns0="http://schemas.microsoft.com/office/word/2010/wordml" ns0:paraId="31954C22" ns0:textId="77777777">
     <w:r>
       <w:t xml:space="preserve">WordToolkit • strona parzysta • </w:t>
     </w:r>
@@ -5909,7 +5909,7 @@
 
 <file path=word/footer7.xml><?xml version="1.0" encoding="utf-8"?>
 <w:ftr xmlns:w="http://schemas.openxmlformats.org/wordprocessingml/2006/main">
-  <w:p xmlns:ns0="http://schemas.microsoft.com/office/word/2010/wordml" ns0:paraId="2CBB0E69" ns0:textId="77777777">
+  <w:p xmlns:ns0="http://schemas.microsoft.com/office/word/2010/wordml" ns0:paraId="4D8B8456" ns0:textId="77777777">
     <w:r>
       <w:t xml:space="preserve">WordToolkit • test zaawansowany • </w:t>
     </w:r>
@@ -5932,7 +5932,7 @@
 
 <file path=word/footer8.xml><?xml version="1.0" encoding="utf-8"?>
 <w:ftr xmlns:w="http://schemas.openxmlformats.org/wordprocessingml/2006/main">
-  <w:p xmlns:ns0="http://schemas.microsoft.com/office/word/2010/wordml" ns0:paraId="6DD74E98" ns0:textId="77777777">
+  <w:p xmlns:ns0="http://schemas.microsoft.com/office/word/2010/wordml" ns0:paraId="46B6E88B" ns0:textId="77777777">
     <w:r>
       <w:t xml:space="preserve">WordToolkit • sekcja 3 • </w:t>
     </w:r>
@@ -5955,7 +5955,7 @@
 
 <file path=word/footer9.xml><?xml version="1.0" encoding="utf-8"?>
 <w:ftr xmlns:w="http://schemas.openxmlformats.org/wordprocessingml/2006/main">
-  <w:p xmlns:ns0="http://schemas.microsoft.com/office/word/2010/wordml" ns0:paraId="27FF3376" ns0:textId="77777777">
+  <w:p xmlns:ns0="http://schemas.microsoft.com/office/word/2010/wordml" ns0:paraId="0F8CD014" ns0:textId="77777777">
     <w:r>
       <w:t xml:space="preserve">WordToolkit • strona parzysta • </w:t>
     </w:r>
@@ -6028,7 +6028,7 @@
 
 <file path=word/header10.xml><?xml version="1.0" encoding="utf-8"?>
 <w:hdr xmlns:w="http://schemas.openxmlformats.org/wordprocessingml/2006/main">
-  <w:p xmlns:ns0="http://schemas.microsoft.com/office/word/2010/wordml" ns0:paraId="5235BAB2" ns0:textId="77777777">
+  <w:p xmlns:ns0="http://schemas.microsoft.com/office/word/2010/wordml" ns0:paraId="4F637F0B" ns0:textId="77777777">
     <w:r>
       <w:t>WordToolkit • strona parzysta</w:t>
     </w:r>
@@ -6038,7 +6038,7 @@
 
 <file path=word/header11.xml><?xml version="1.0" encoding="utf-8"?>
 <w:hdr xmlns:w="http://schemas.openxmlformats.org/wordprocessingml/2006/main">
-  <w:p xmlns:ns0="http://schemas.microsoft.com/office/word/2010/wordml" ns0:paraId="572A7FBD" ns0:textId="77777777">
+  <w:p xmlns:ns0="http://schemas.microsoft.com/office/word/2010/wordml" ns0:paraId="37F44866" ns0:textId="77777777">
     <w:r>
       <w:t>WordToolkit • sekcja 4</w:t>
     </w:r>
@@ -6048,7 +6048,7 @@
 
 <file path=word/header12.xml><?xml version="1.0" encoding="utf-8"?>
 <w:hdr xmlns:w="http://schemas.openxmlformats.org/wordprocessingml/2006/main">
-  <w:p xmlns:ns0="http://schemas.microsoft.com/office/word/2010/wordml" ns0:paraId="53BED189" ns0:textId="77777777">
+  <w:p xmlns:ns0="http://schemas.microsoft.com/office/word/2010/wordml" ns0:paraId="333CA937" ns0:textId="77777777">
     <w:r>
       <w:t>WordToolkit • strona parzysta</w:t>
     </w:r>
@@ -6058,7 +6058,7 @@
 
 <file path=word/header2.xml><?xml version="1.0" encoding="utf-8"?>
 <w:hdr xmlns:w="http://schemas.openxmlformats.org/wordprocessingml/2006/main">
-  <w:p xmlns:ns0="http://schemas.microsoft.com/office/word/2010/wordml" ns0:paraId="66AEBA7E" ns0:textId="77777777">
+  <w:p xmlns:ns0="http://schemas.microsoft.com/office/word/2010/wordml" ns0:paraId="297C3251" ns0:textId="77777777">
     <w:r>
       <w:t>WordToolkit • test zaawansowany</w:t>
     </w:r>
@@ -6068,7 +6068,7 @@
 
 <file path=word/header3.xml><?xml version="1.0" encoding="utf-8"?>
 <w:hdr xmlns:w="http://schemas.openxmlformats.org/wordprocessingml/2006/main">
-  <w:p xmlns:ns0="http://schemas.microsoft.com/office/word/2010/wordml" ns0:paraId="27021435" ns0:textId="77777777">
+  <w:p xmlns:ns0="http://schemas.microsoft.com/office/word/2010/wordml" ns0:paraId="09FAB665" ns0:textId="77777777">
     <w:r>
       <w:t>WordToolkit • sekcja 1</w:t>
     </w:r>
@@ -6078,7 +6078,7 @@
 
 <file path=word/header4.xml><?xml version="1.0" encoding="utf-8"?>
 <w:hdr xmlns:w="http://schemas.openxmlformats.org/wordprocessingml/2006/main">
-  <w:p xmlns:ns0="http://schemas.microsoft.com/office/word/2010/wordml" ns0:paraId="42C2B58A" ns0:textId="77777777">
+  <w:p xmlns:ns0="http://schemas.microsoft.com/office/word/2010/wordml" ns0:paraId="4A2A418A" ns0:textId="77777777">
     <w:r>
       <w:t>WordToolkit • strona parzysta</w:t>
     </w:r>
@@ -6088,7 +6088,7 @@
 
 <file path=word/header5.xml><?xml version="1.0" encoding="utf-8"?>
 <w:hdr xmlns:w="http://schemas.openxmlformats.org/wordprocessingml/2006/main">
-  <w:p xmlns:ns0="http://schemas.microsoft.com/office/word/2010/wordml" ns0:paraId="46D98D87" ns0:textId="77777777">
+  <w:p xmlns:ns0="http://schemas.microsoft.com/office/word/2010/wordml" ns0:paraId="267BE88D" ns0:textId="77777777">
     <w:r>
       <w:t>WordToolkit • test zaawansowany</w:t>
     </w:r>
@@ -6098,7 +6098,7 @@
 
 <file path=word/header6.xml><?xml version="1.0" encoding="utf-8"?>
 <w:hdr xmlns:w="http://schemas.openxmlformats.org/wordprocessingml/2006/main">
-  <w:p xmlns:ns0="http://schemas.microsoft.com/office/word/2010/wordml" ns0:paraId="5FC74444" ns0:textId="77777777">
+  <w:p xmlns:ns0="http://schemas.microsoft.com/office/word/2010/wordml" ns0:paraId="533D1BFC" ns0:textId="77777777">
     <w:r>
       <w:t>WordToolkit • sekcja 2</w:t>
     </w:r>
@@ -6108,7 +6108,7 @@
 
 <file path=word/header7.xml><?xml version="1.0" encoding="utf-8"?>
 <w:hdr xmlns:w="http://schemas.openxmlformats.org/wordprocessingml/2006/main">
-  <w:p xmlns:ns0="http://schemas.microsoft.com/office/word/2010/wordml" ns0:paraId="1F0466A9" ns0:textId="77777777">
+  <w:p xmlns:ns0="http://schemas.microsoft.com/office/word/2010/wordml" ns0:paraId="0FA88B22" ns0:textId="77777777">
     <w:r>
       <w:t>WordToolkit • strona parzysta</w:t>
     </w:r>
@@ -6118,7 +6118,7 @@
 
 <file path=word/header8.xml><?xml version="1.0" encoding="utf-8"?>
 <w:hdr xmlns:w="http://schemas.openxmlformats.org/wordprocessingml/2006/main">
-  <w:p xmlns:ns0="http://schemas.microsoft.com/office/word/2010/wordml" ns0:paraId="07726F1C" ns0:textId="77777777">
+  <w:p xmlns:ns0="http://schemas.microsoft.com/office/word/2010/wordml" ns0:paraId="548F6F0D" ns0:textId="77777777">
     <w:r>
       <w:t>WordToolkit • test zaawansowany</w:t>
     </w:r>
@@ -6128,7 +6128,7 @@
 
 <file path=word/header9.xml><?xml version="1.0" encoding="utf-8"?>
 <w:hdr xmlns:w="http://schemas.openxmlformats.org/wordprocessingml/2006/main">
-  <w:p xmlns:ns0="http://schemas.microsoft.com/office/word/2010/wordml" ns0:paraId="71F8171A" ns0:textId="77777777">
+  <w:p xmlns:ns0="http://schemas.microsoft.com/office/word/2010/wordml" ns0:paraId="04033870" ns0:textId="77777777">
     <w:r>
       <w:t>WordToolkit • sekcja 3</w:t>
     </w:r>

</xml_diff>